<commit_message>
feat:estructura inicial del proyecto
</commit_message>
<xml_diff>
--- a/docuumentacion y requerimientos.docx
+++ b/docuumentacion y requerimientos.docx
@@ -5,21 +5,22 @@
     <w:p>
       <w:pPr>
         <w:spacing w:after="80" w:lineRule="auto"/>
+        <w:jc w:val="center"/>
         <w:rPr>
           <w:b w:val="1"/>
           <w:bCs w:val="1"/>
-          <w:color w:val="1b365d"/>
-          <w:sz w:val="48"/>
-          <w:szCs w:val="48"/>
+          <w:color w:val="434343"/>
+          <w:sz w:val="24"/>
+          <w:szCs w:val="24"/>
         </w:rPr>
       </w:pPr>
       <w:r>
         <w:rPr>
           <w:b w:val="1"/>
           <w:bCs w:val="1"/>
-          <w:color w:val="1b365d"/>
-          <w:sz w:val="48"/>
-          <w:szCs w:val="48"/>
+          <w:color w:val="434343"/>
+          <w:sz w:val="24"/>
+          <w:szCs w:val="24"/>
           <w:rtl w:val="0"/>
         </w:rPr>
         <w:t xml:space="preserve">Documentación Técnica de Software</w:t>
@@ -30,23 +31,35 @@
         <w:spacing w:after="360" w:before="220" w:lineRule="auto"/>
         <w:jc w:val="center"/>
         <w:rPr>
-          <w:i w:val="1"/>
-          <w:iCs w:val="1"/>
-          <w:color w:val="4a5568"/>
-          <w:sz w:val="26"/>
-          <w:szCs w:val="26"/>
+          <w:color w:val="434343"/>
+          <w:sz w:val="24"/>
+          <w:szCs w:val="24"/>
         </w:rPr>
       </w:pPr>
       <w:r>
         <w:rPr>
-          <w:i w:val="1"/>
-          <w:iCs w:val="1"/>
-          <w:color w:val="4a5568"/>
-          <w:sz w:val="26"/>
-          <w:szCs w:val="26"/>
+          <w:color w:val="434343"/>
+          <w:sz w:val="24"/>
+          <w:szCs w:val="24"/>
           <w:rtl w:val="0"/>
         </w:rPr>
         <w:t xml:space="preserve">Proyecto: Portal Web y Móvil Universitario Informativo </w:t>
+      </w:r>
+    </w:p>
+    <w:p>
+      <w:pPr>
+        <w:spacing w:after="360" w:before="220" w:lineRule="auto"/>
+        <w:jc w:val="center"/>
+        <w:rPr>
+          <w:color w:val="434343"/>
+          <w:sz w:val="24"/>
+          <w:szCs w:val="24"/>
+        </w:rPr>
+      </w:pPr>
+      <w:r>
+        <w:rPr>
+          <w:rtl w:val="0"/>
+        </w:rPr>
       </w:r>
     </w:p>
     <w:tbl>
@@ -84,12 +97,12 @@
         <w:tc>
           <w:tcPr>
             <w:tcBorders>
-              <w:top w:color="000000" w:space="0" w:sz="0" w:val="nil"/>
-              <w:left w:color="000000" w:space="0" w:sz="0" w:val="nil"/>
-              <w:bottom w:color="000000" w:space="0" w:sz="0" w:val="nil"/>
-              <w:right w:color="000000" w:space="0" w:sz="0" w:val="nil"/>
-            </w:tcBorders>
-            <w:shd w:fill="f4f6f9" w:val="clear"/>
+              <w:top w:color="000000" w:space="0" w:sz="8" w:val="single"/>
+              <w:left w:color="000000" w:space="0" w:sz="8" w:val="single"/>
+              <w:bottom w:color="000000" w:space="0" w:sz="8" w:val="single"/>
+              <w:right w:color="000000" w:space="0" w:sz="8" w:val="single"/>
+            </w:tcBorders>
+            <w:shd w:fill="cfe2f3" w:val="clear"/>
             <w:tcMar>
               <w:top w:w="80.0" w:type="dxa"/>
               <w:left w:w="120.0" w:type="dxa"/>
@@ -104,14 +117,18 @@
               <w:rPr>
                 <w:b w:val="1"/>
                 <w:bCs w:val="1"/>
-                <w:color w:val="1b365d"/>
-              </w:rPr>
-            </w:pPr>
-            <w:r>
-              <w:rPr>
-                <w:b w:val="1"/>
-                <w:bCs w:val="1"/>
-                <w:color w:val="1b365d"/>
+                <w:color w:val="434343"/>
+                <w:sz w:val="24"/>
+                <w:szCs w:val="24"/>
+              </w:rPr>
+            </w:pPr>
+            <w:r>
+              <w:rPr>
+                <w:b w:val="1"/>
+                <w:bCs w:val="1"/>
+                <w:color w:val="434343"/>
+                <w:sz w:val="24"/>
+                <w:szCs w:val="24"/>
                 <w:rtl w:val="0"/>
               </w:rPr>
               <w:t xml:space="preserve">Tipo de Entregable:</w:t>
@@ -121,12 +138,12 @@
         <w:tc>
           <w:tcPr>
             <w:tcBorders>
-              <w:top w:color="000000" w:space="0" w:sz="0" w:val="nil"/>
-              <w:left w:color="000000" w:space="0" w:sz="0" w:val="nil"/>
-              <w:bottom w:color="000000" w:space="0" w:sz="0" w:val="nil"/>
-              <w:right w:color="000000" w:space="0" w:sz="0" w:val="nil"/>
-            </w:tcBorders>
-            <w:shd w:fill="f4f6f9" w:val="clear"/>
+              <w:top w:color="000000" w:space="0" w:sz="8" w:val="single"/>
+              <w:left w:color="000000" w:space="0" w:sz="8" w:val="single"/>
+              <w:bottom w:color="000000" w:space="0" w:sz="8" w:val="single"/>
+              <w:right w:color="000000" w:space="0" w:sz="8" w:val="single"/>
+            </w:tcBorders>
+            <w:shd w:fill="ffffff" w:val="clear"/>
             <w:tcMar>
               <w:top w:w="80.0" w:type="dxa"/>
               <w:left w:w="120.0" w:type="dxa"/>
@@ -139,12 +156,16 @@
             <w:pPr>
               <w:spacing w:after="200" w:before="220" w:lineRule="auto"/>
               <w:rPr>
-                <w:color w:val="2d3748"/>
-              </w:rPr>
-            </w:pPr>
-            <w:r>
-              <w:rPr>
-                <w:color w:val="2d3748"/>
+                <w:color w:val="434343"/>
+                <w:sz w:val="24"/>
+                <w:szCs w:val="24"/>
+              </w:rPr>
+            </w:pPr>
+            <w:r>
+              <w:rPr>
+                <w:color w:val="434343"/>
+                <w:sz w:val="24"/>
+                <w:szCs w:val="24"/>
                 <w:rtl w:val="0"/>
               </w:rPr>
               <w:t xml:space="preserve">Documentación Completa de Taller, Requerimientos (RF/RNF) y Código</w:t>
@@ -161,12 +182,12 @@
         <w:tc>
           <w:tcPr>
             <w:tcBorders>
-              <w:top w:color="000000" w:space="0" w:sz="0" w:val="nil"/>
-              <w:left w:color="000000" w:space="0" w:sz="0" w:val="nil"/>
-              <w:bottom w:color="000000" w:space="0" w:sz="0" w:val="nil"/>
-              <w:right w:color="000000" w:space="0" w:sz="0" w:val="nil"/>
-            </w:tcBorders>
-            <w:shd w:fill="f4f6f9" w:val="clear"/>
+              <w:top w:color="000000" w:space="0" w:sz="8" w:val="single"/>
+              <w:left w:color="000000" w:space="0" w:sz="8" w:val="single"/>
+              <w:bottom w:color="000000" w:space="0" w:sz="8" w:val="single"/>
+              <w:right w:color="000000" w:space="0" w:sz="8" w:val="single"/>
+            </w:tcBorders>
+            <w:shd w:fill="cfe2f3" w:val="clear"/>
             <w:tcMar>
               <w:top w:w="80.0" w:type="dxa"/>
               <w:left w:w="120.0" w:type="dxa"/>
@@ -181,14 +202,18 @@
               <w:rPr>
                 <w:b w:val="1"/>
                 <w:bCs w:val="1"/>
-                <w:color w:val="1b365d"/>
-              </w:rPr>
-            </w:pPr>
-            <w:r>
-              <w:rPr>
-                <w:b w:val="1"/>
-                <w:bCs w:val="1"/>
-                <w:color w:val="1b365d"/>
+                <w:color w:val="434343"/>
+                <w:sz w:val="24"/>
+                <w:szCs w:val="24"/>
+              </w:rPr>
+            </w:pPr>
+            <w:r>
+              <w:rPr>
+                <w:b w:val="1"/>
+                <w:bCs w:val="1"/>
+                <w:color w:val="434343"/>
+                <w:sz w:val="24"/>
+                <w:szCs w:val="24"/>
                 <w:rtl w:val="0"/>
               </w:rPr>
               <w:t xml:space="preserve">Stack Tecnológico:</w:t>
@@ -198,12 +223,12 @@
         <w:tc>
           <w:tcPr>
             <w:tcBorders>
-              <w:top w:color="000000" w:space="0" w:sz="0" w:val="nil"/>
-              <w:left w:color="000000" w:space="0" w:sz="0" w:val="nil"/>
-              <w:bottom w:color="000000" w:space="0" w:sz="0" w:val="nil"/>
-              <w:right w:color="000000" w:space="0" w:sz="0" w:val="nil"/>
-            </w:tcBorders>
-            <w:shd w:fill="f4f6f9" w:val="clear"/>
+              <w:top w:color="000000" w:space="0" w:sz="8" w:val="single"/>
+              <w:left w:color="000000" w:space="0" w:sz="8" w:val="single"/>
+              <w:bottom w:color="000000" w:space="0" w:sz="8" w:val="single"/>
+              <w:right w:color="000000" w:space="0" w:sz="8" w:val="single"/>
+            </w:tcBorders>
+            <w:shd w:fill="ffffff" w:val="clear"/>
             <w:tcMar>
               <w:top w:w="80.0" w:type="dxa"/>
               <w:left w:w="120.0" w:type="dxa"/>
@@ -216,12 +241,16 @@
             <w:pPr>
               <w:spacing w:after="200" w:before="220" w:lineRule="auto"/>
               <w:rPr>
-                <w:color w:val="2d3748"/>
-              </w:rPr>
-            </w:pPr>
-            <w:r>
-              <w:rPr>
-                <w:color w:val="2d3748"/>
+                <w:color w:val="434343"/>
+                <w:sz w:val="24"/>
+                <w:szCs w:val="24"/>
+              </w:rPr>
+            </w:pPr>
+            <w:r>
+              <w:rPr>
+                <w:color w:val="434343"/>
+                <w:sz w:val="24"/>
+                <w:szCs w:val="24"/>
                 <w:rtl w:val="0"/>
               </w:rPr>
               <w:t xml:space="preserve">MySQL (BD) + Node.js Express (Backend API) + Flutter / Dart (Frontend)</w:t>
@@ -238,12 +267,12 @@
         <w:tc>
           <w:tcPr>
             <w:tcBorders>
-              <w:top w:color="000000" w:space="0" w:sz="0" w:val="nil"/>
-              <w:left w:color="000000" w:space="0" w:sz="0" w:val="nil"/>
-              <w:bottom w:color="000000" w:space="0" w:sz="0" w:val="nil"/>
-              <w:right w:color="000000" w:space="0" w:sz="0" w:val="nil"/>
-            </w:tcBorders>
-            <w:shd w:fill="f4f6f9" w:val="clear"/>
+              <w:top w:color="000000" w:space="0" w:sz="8" w:val="single"/>
+              <w:left w:color="000000" w:space="0" w:sz="8" w:val="single"/>
+              <w:bottom w:color="000000" w:space="0" w:sz="8" w:val="single"/>
+              <w:right w:color="000000" w:space="0" w:sz="8" w:val="single"/>
+            </w:tcBorders>
+            <w:shd w:fill="cfe2f3" w:val="clear"/>
             <w:tcMar>
               <w:top w:w="80.0" w:type="dxa"/>
               <w:left w:w="120.0" w:type="dxa"/>
@@ -258,14 +287,18 @@
               <w:rPr>
                 <w:b w:val="1"/>
                 <w:bCs w:val="1"/>
-                <w:color w:val="1b365d"/>
-              </w:rPr>
-            </w:pPr>
-            <w:r>
-              <w:rPr>
-                <w:b w:val="1"/>
-                <w:bCs w:val="1"/>
-                <w:color w:val="1b365d"/>
+                <w:color w:val="434343"/>
+                <w:sz w:val="24"/>
+                <w:szCs w:val="24"/>
+              </w:rPr>
+            </w:pPr>
+            <w:r>
+              <w:rPr>
+                <w:b w:val="1"/>
+                <w:bCs w:val="1"/>
+                <w:color w:val="434343"/>
+                <w:sz w:val="24"/>
+                <w:szCs w:val="24"/>
                 <w:rtl w:val="0"/>
               </w:rPr>
               <w:t xml:space="preserve">Versión y Estado:</w:t>
@@ -275,12 +308,12 @@
         <w:tc>
           <w:tcPr>
             <w:tcBorders>
-              <w:top w:color="000000" w:space="0" w:sz="0" w:val="nil"/>
-              <w:left w:color="000000" w:space="0" w:sz="0" w:val="nil"/>
-              <w:bottom w:color="000000" w:space="0" w:sz="0" w:val="nil"/>
-              <w:right w:color="000000" w:space="0" w:sz="0" w:val="nil"/>
-            </w:tcBorders>
-            <w:shd w:fill="f4f6f9" w:val="clear"/>
+              <w:top w:color="000000" w:space="0" w:sz="8" w:val="single"/>
+              <w:left w:color="000000" w:space="0" w:sz="8" w:val="single"/>
+              <w:bottom w:color="000000" w:space="0" w:sz="8" w:val="single"/>
+              <w:right w:color="000000" w:space="0" w:sz="8" w:val="single"/>
+            </w:tcBorders>
+            <w:shd w:fill="ffffff" w:val="clear"/>
             <w:tcMar>
               <w:top w:w="80.0" w:type="dxa"/>
               <w:left w:w="120.0" w:type="dxa"/>
@@ -293,12 +326,16 @@
             <w:pPr>
               <w:spacing w:after="200" w:before="220" w:lineRule="auto"/>
               <w:rPr>
-                <w:color w:val="2d3748"/>
-              </w:rPr>
-            </w:pPr>
-            <w:r>
-              <w:rPr>
-                <w:color w:val="2d3748"/>
+                <w:color w:val="434343"/>
+                <w:sz w:val="24"/>
+                <w:szCs w:val="24"/>
+              </w:rPr>
+            </w:pPr>
+            <w:r>
+              <w:rPr>
+                <w:color w:val="434343"/>
+                <w:sz w:val="24"/>
+                <w:szCs w:val="24"/>
                 <w:rtl w:val="0"/>
               </w:rPr>
               <w:t xml:space="preserve">Versión 1.0.0 - Documento Oficial de Desarrollo</w:t>
@@ -315,12 +352,12 @@
         <w:tc>
           <w:tcPr>
             <w:tcBorders>
-              <w:top w:color="000000" w:space="0" w:sz="0" w:val="nil"/>
-              <w:left w:color="000000" w:space="0" w:sz="0" w:val="nil"/>
-              <w:bottom w:color="000000" w:space="0" w:sz="0" w:val="nil"/>
-              <w:right w:color="000000" w:space="0" w:sz="0" w:val="nil"/>
-            </w:tcBorders>
-            <w:shd w:fill="f4f6f9" w:val="clear"/>
+              <w:top w:color="000000" w:space="0" w:sz="8" w:val="single"/>
+              <w:left w:color="000000" w:space="0" w:sz="8" w:val="single"/>
+              <w:bottom w:color="000000" w:space="0" w:sz="8" w:val="single"/>
+              <w:right w:color="000000" w:space="0" w:sz="8" w:val="single"/>
+            </w:tcBorders>
+            <w:shd w:fill="cfe2f3" w:val="clear"/>
             <w:tcMar>
               <w:top w:w="80.0" w:type="dxa"/>
               <w:left w:w="120.0" w:type="dxa"/>
@@ -335,14 +372,18 @@
               <w:rPr>
                 <w:b w:val="1"/>
                 <w:bCs w:val="1"/>
-                <w:color w:val="1b365d"/>
-              </w:rPr>
-            </w:pPr>
-            <w:r>
-              <w:rPr>
-                <w:b w:val="1"/>
-                <w:bCs w:val="1"/>
-                <w:color w:val="1b365d"/>
+                <w:color w:val="434343"/>
+                <w:sz w:val="24"/>
+                <w:szCs w:val="24"/>
+              </w:rPr>
+            </w:pPr>
+            <w:r>
+              <w:rPr>
+                <w:b w:val="1"/>
+                <w:bCs w:val="1"/>
+                <w:color w:val="434343"/>
+                <w:sz w:val="24"/>
+                <w:szCs w:val="24"/>
                 <w:rtl w:val="0"/>
               </w:rPr>
               <w:t xml:space="preserve">Dirigido a:</w:t>
@@ -352,12 +393,12 @@
         <w:tc>
           <w:tcPr>
             <w:tcBorders>
-              <w:top w:color="000000" w:space="0" w:sz="0" w:val="nil"/>
-              <w:left w:color="000000" w:space="0" w:sz="0" w:val="nil"/>
-              <w:bottom w:color="000000" w:space="0" w:sz="0" w:val="nil"/>
-              <w:right w:color="000000" w:space="0" w:sz="0" w:val="nil"/>
-            </w:tcBorders>
-            <w:shd w:fill="f4f6f9" w:val="clear"/>
+              <w:top w:color="000000" w:space="0" w:sz="8" w:val="single"/>
+              <w:left w:color="000000" w:space="0" w:sz="8" w:val="single"/>
+              <w:bottom w:color="000000" w:space="0" w:sz="8" w:val="single"/>
+              <w:right w:color="000000" w:space="0" w:sz="8" w:val="single"/>
+            </w:tcBorders>
+            <w:shd w:fill="ffffff" w:val="clear"/>
             <w:tcMar>
               <w:top w:w="80.0" w:type="dxa"/>
               <w:left w:w="120.0" w:type="dxa"/>
@@ -370,12 +411,16 @@
             <w:pPr>
               <w:spacing w:after="200" w:before="220" w:lineRule="auto"/>
               <w:rPr>
-                <w:color w:val="2d3748"/>
-              </w:rPr>
-            </w:pPr>
-            <w:r>
-              <w:rPr>
-                <w:color w:val="2d3748"/>
+                <w:color w:val="434343"/>
+                <w:sz w:val="24"/>
+                <w:szCs w:val="24"/>
+              </w:rPr>
+            </w:pPr>
+            <w:r>
+              <w:rPr>
+                <w:color w:val="434343"/>
+                <w:sz w:val="24"/>
+                <w:szCs w:val="24"/>
                 <w:rtl w:val="0"/>
               </w:rPr>
               <w:t xml:space="preserve">Evaluación Técnica de Análisis y Desarrollo de Software (SENA CEET)</w:t>
@@ -388,12 +433,16 @@
       <w:pPr>
         <w:spacing w:after="240" w:before="220" w:lineRule="auto"/>
         <w:rPr>
-          <w:color w:val="2d3748"/>
+          <w:color w:val="434343"/>
+          <w:sz w:val="24"/>
+          <w:szCs w:val="24"/>
         </w:rPr>
       </w:pPr>
       <w:r>
         <w:rPr>
-          <w:color w:val="2d3748"/>
+          <w:color w:val="434343"/>
+          <w:sz w:val="24"/>
+          <w:szCs w:val="24"/>
           <w:rtl w:val="0"/>
         </w:rPr>
         <w:t xml:space="preserve"> </w:t>
@@ -405,18 +454,18 @@
         <w:rPr>
           <w:b w:val="1"/>
           <w:bCs w:val="1"/>
-          <w:color w:val="1b365d"/>
-          <w:sz w:val="36"/>
-          <w:szCs w:val="36"/>
+          <w:color w:val="434343"/>
+          <w:sz w:val="24"/>
+          <w:szCs w:val="24"/>
         </w:rPr>
       </w:pPr>
       <w:r>
         <w:rPr>
           <w:b w:val="1"/>
           <w:bCs w:val="1"/>
-          <w:color w:val="1b365d"/>
-          <w:sz w:val="36"/>
-          <w:szCs w:val="36"/>
+          <w:color w:val="434343"/>
+          <w:sz w:val="24"/>
+          <w:szCs w:val="24"/>
           <w:rtl w:val="0"/>
         </w:rPr>
         <w:t xml:space="preserve">1. Introducción y Descripción General</w:t>
@@ -426,12 +475,16 @@
       <w:pPr>
         <w:spacing w:after="200" w:before="220" w:lineRule="auto"/>
         <w:rPr>
-          <w:color w:val="2d3748"/>
+          <w:color w:val="434343"/>
+          <w:sz w:val="24"/>
+          <w:szCs w:val="24"/>
         </w:rPr>
       </w:pPr>
       <w:r>
         <w:rPr>
-          <w:color w:val="2d3748"/>
+          <w:color w:val="434343"/>
+          <w:sz w:val="24"/>
+          <w:szCs w:val="24"/>
           <w:rtl w:val="0"/>
         </w:rPr>
         <w:t xml:space="preserve">El presente documento constituye la especificación técnica y de requerimientos para el desarrollo de una plataforma informativa universitaria. El sistema está compuesto por una arquitectura multicapa desacoplada que incluye una base de datos relacional (MySQL), una interfaz de programación de aplicaciones REST (Node.js/Express) y una aplicación frontend multiplataforma desarrollada en Flutter.</w:t>
@@ -443,18 +496,18 @@
         <w:rPr>
           <w:b w:val="1"/>
           <w:bCs w:val="1"/>
-          <w:color w:val="2b6cb0"/>
-          <w:sz w:val="28"/>
-          <w:szCs w:val="28"/>
+          <w:color w:val="434343"/>
+          <w:sz w:val="24"/>
+          <w:szCs w:val="24"/>
         </w:rPr>
       </w:pPr>
       <w:r>
         <w:rPr>
           <w:b w:val="1"/>
           <w:bCs w:val="1"/>
-          <w:color w:val="2b6cb0"/>
-          <w:sz w:val="28"/>
-          <w:szCs w:val="28"/>
+          <w:color w:val="434343"/>
+          <w:sz w:val="24"/>
+          <w:szCs w:val="24"/>
           <w:rtl w:val="0"/>
         </w:rPr>
         <w:t xml:space="preserve">1.1 Propósito y Alcance</w:t>
@@ -464,12 +517,16 @@
       <w:pPr>
         <w:spacing w:after="200" w:before="220" w:lineRule="auto"/>
         <w:rPr>
-          <w:color w:val="2d3748"/>
+          <w:color w:val="434343"/>
+          <w:sz w:val="24"/>
+          <w:szCs w:val="24"/>
         </w:rPr>
       </w:pPr>
       <w:r>
         <w:rPr>
-          <w:color w:val="2d3748"/>
+          <w:color w:val="434343"/>
+          <w:sz w:val="24"/>
+          <w:szCs w:val="24"/>
           <w:rtl w:val="0"/>
         </w:rPr>
         <w:t xml:space="preserve">El objetivo principal del proyecto es proporcionar a los estudiantes y visitantes un acceso ágil y directo a la oferta académica de la institución (materias, horarios, aulas y cuerpo docente) sin requerir mecanismos de autenticación o inicio de sesión (login), eliminando barreras de acceso para la consulta pública.</w:t>
@@ -481,18 +538,18 @@
         <w:rPr>
           <w:b w:val="1"/>
           <w:bCs w:val="1"/>
-          <w:color w:val="1b365d"/>
-          <w:sz w:val="36"/>
-          <w:szCs w:val="36"/>
+          <w:color w:val="434343"/>
+          <w:sz w:val="24"/>
+          <w:szCs w:val="24"/>
         </w:rPr>
       </w:pPr>
       <w:r>
         <w:rPr>
           <w:b w:val="1"/>
           <w:bCs w:val="1"/>
-          <w:color w:val="1b365d"/>
-          <w:sz w:val="36"/>
-          <w:szCs w:val="36"/>
+          <w:color w:val="434343"/>
+          <w:sz w:val="24"/>
+          <w:szCs w:val="24"/>
           <w:rtl w:val="0"/>
         </w:rPr>
         <w:t xml:space="preserve">2. Especificación de Requerimientos del Sistema</w:t>
@@ -504,18 +561,18 @@
         <w:rPr>
           <w:b w:val="1"/>
           <w:bCs w:val="1"/>
-          <w:color w:val="2b6cb0"/>
-          <w:sz w:val="28"/>
-          <w:szCs w:val="28"/>
+          <w:color w:val="434343"/>
+          <w:sz w:val="24"/>
+          <w:szCs w:val="24"/>
         </w:rPr>
       </w:pPr>
       <w:r>
         <w:rPr>
           <w:b w:val="1"/>
           <w:bCs w:val="1"/>
-          <w:color w:val="2b6cb0"/>
-          <w:sz w:val="28"/>
-          <w:szCs w:val="28"/>
+          <w:color w:val="434343"/>
+          <w:sz w:val="24"/>
+          <w:szCs w:val="24"/>
           <w:rtl w:val="0"/>
         </w:rPr>
         <w:t xml:space="preserve">2.1 Requerimientos Funcionales (RF)</w:t>
@@ -525,12 +582,16 @@
       <w:pPr>
         <w:spacing w:after="200" w:before="220" w:lineRule="auto"/>
         <w:rPr>
-          <w:color w:val="2d3748"/>
+          <w:color w:val="434343"/>
+          <w:sz w:val="24"/>
+          <w:szCs w:val="24"/>
         </w:rPr>
       </w:pPr>
       <w:r>
         <w:rPr>
-          <w:color w:val="2d3748"/>
+          <w:color w:val="434343"/>
+          <w:sz w:val="24"/>
+          <w:szCs w:val="24"/>
           <w:rtl w:val="0"/>
         </w:rPr>
         <w:t xml:space="preserve">Los requerimientos funcionales especifican los servicios y comportamientos operativos que el sistema debe proveer a los usuarios:</w:t>
@@ -575,12 +636,12 @@
         <w:tc>
           <w:tcPr>
             <w:tcBorders>
-              <w:top w:color="000000" w:space="0" w:sz="0" w:val="nil"/>
-              <w:left w:color="000000" w:space="0" w:sz="0" w:val="nil"/>
-              <w:bottom w:color="000000" w:space="0" w:sz="0" w:val="nil"/>
-              <w:right w:color="000000" w:space="0" w:sz="0" w:val="nil"/>
-            </w:tcBorders>
-            <w:shd w:fill="1b365d" w:val="clear"/>
+              <w:top w:color="000000" w:space="0" w:sz="8" w:val="single"/>
+              <w:left w:color="000000" w:space="0" w:sz="8" w:val="single"/>
+              <w:bottom w:color="000000" w:space="0" w:sz="8" w:val="single"/>
+              <w:right w:color="000000" w:space="0" w:sz="8" w:val="single"/>
+            </w:tcBorders>
+            <w:shd w:fill="d9ead3" w:val="clear"/>
             <w:tcMar>
               <w:top w:w="100.0" w:type="dxa"/>
               <w:left w:w="100.0" w:type="dxa"/>
@@ -595,14 +656,18 @@
               <w:rPr>
                 <w:b w:val="1"/>
                 <w:bCs w:val="1"/>
-                <w:color w:val="ffffff"/>
-              </w:rPr>
-            </w:pPr>
-            <w:r>
-              <w:rPr>
-                <w:b w:val="1"/>
-                <w:bCs w:val="1"/>
-                <w:color w:val="ffffff"/>
+                <w:color w:val="434343"/>
+                <w:sz w:val="24"/>
+                <w:szCs w:val="24"/>
+              </w:rPr>
+            </w:pPr>
+            <w:r>
+              <w:rPr>
+                <w:b w:val="1"/>
+                <w:bCs w:val="1"/>
+                <w:color w:val="434343"/>
+                <w:sz w:val="24"/>
+                <w:szCs w:val="24"/>
                 <w:rtl w:val="0"/>
               </w:rPr>
               <w:t xml:space="preserve">Código</w:t>
@@ -612,12 +677,12 @@
         <w:tc>
           <w:tcPr>
             <w:tcBorders>
-              <w:top w:color="000000" w:space="0" w:sz="0" w:val="nil"/>
-              <w:left w:color="000000" w:space="0" w:sz="0" w:val="nil"/>
-              <w:bottom w:color="000000" w:space="0" w:sz="0" w:val="nil"/>
-              <w:right w:color="000000" w:space="0" w:sz="0" w:val="nil"/>
-            </w:tcBorders>
-            <w:shd w:fill="1b365d" w:val="clear"/>
+              <w:top w:color="000000" w:space="0" w:sz="8" w:val="single"/>
+              <w:left w:color="000000" w:space="0" w:sz="8" w:val="single"/>
+              <w:bottom w:color="000000" w:space="0" w:sz="8" w:val="single"/>
+              <w:right w:color="000000" w:space="0" w:sz="8" w:val="single"/>
+            </w:tcBorders>
+            <w:shd w:fill="d9ead3" w:val="clear"/>
             <w:tcMar>
               <w:top w:w="100.0" w:type="dxa"/>
               <w:left w:w="100.0" w:type="dxa"/>
@@ -632,14 +697,18 @@
               <w:rPr>
                 <w:b w:val="1"/>
                 <w:bCs w:val="1"/>
-                <w:color w:val="ffffff"/>
-              </w:rPr>
-            </w:pPr>
-            <w:r>
-              <w:rPr>
-                <w:b w:val="1"/>
-                <w:bCs w:val="1"/>
-                <w:color w:val="ffffff"/>
+                <w:color w:val="434343"/>
+                <w:sz w:val="24"/>
+                <w:szCs w:val="24"/>
+              </w:rPr>
+            </w:pPr>
+            <w:r>
+              <w:rPr>
+                <w:b w:val="1"/>
+                <w:bCs w:val="1"/>
+                <w:color w:val="434343"/>
+                <w:sz w:val="24"/>
+                <w:szCs w:val="24"/>
                 <w:rtl w:val="0"/>
               </w:rPr>
               <w:t xml:space="preserve">Requerimiento</w:t>
@@ -649,12 +718,12 @@
         <w:tc>
           <w:tcPr>
             <w:tcBorders>
-              <w:top w:color="000000" w:space="0" w:sz="0" w:val="nil"/>
-              <w:left w:color="000000" w:space="0" w:sz="0" w:val="nil"/>
-              <w:bottom w:color="000000" w:space="0" w:sz="0" w:val="nil"/>
-              <w:right w:color="000000" w:space="0" w:sz="0" w:val="nil"/>
-            </w:tcBorders>
-            <w:shd w:fill="1b365d" w:val="clear"/>
+              <w:top w:color="000000" w:space="0" w:sz="8" w:val="single"/>
+              <w:left w:color="000000" w:space="0" w:sz="8" w:val="single"/>
+              <w:bottom w:color="000000" w:space="0" w:sz="8" w:val="single"/>
+              <w:right w:color="000000" w:space="0" w:sz="8" w:val="single"/>
+            </w:tcBorders>
+            <w:shd w:fill="d9ead3" w:val="clear"/>
             <w:tcMar>
               <w:top w:w="100.0" w:type="dxa"/>
               <w:left w:w="100.0" w:type="dxa"/>
@@ -669,14 +738,18 @@
               <w:rPr>
                 <w:b w:val="1"/>
                 <w:bCs w:val="1"/>
-                <w:color w:val="ffffff"/>
-              </w:rPr>
-            </w:pPr>
-            <w:r>
-              <w:rPr>
-                <w:b w:val="1"/>
-                <w:bCs w:val="1"/>
-                <w:color w:val="ffffff"/>
+                <w:color w:val="434343"/>
+                <w:sz w:val="24"/>
+                <w:szCs w:val="24"/>
+              </w:rPr>
+            </w:pPr>
+            <w:r>
+              <w:rPr>
+                <w:b w:val="1"/>
+                <w:bCs w:val="1"/>
+                <w:color w:val="434343"/>
+                <w:sz w:val="24"/>
+                <w:szCs w:val="24"/>
                 <w:rtl w:val="0"/>
               </w:rPr>
               <w:t xml:space="preserve">Descripción</w:t>
@@ -686,12 +759,12 @@
         <w:tc>
           <w:tcPr>
             <w:tcBorders>
-              <w:top w:color="000000" w:space="0" w:sz="0" w:val="nil"/>
-              <w:left w:color="000000" w:space="0" w:sz="0" w:val="nil"/>
-              <w:bottom w:color="000000" w:space="0" w:sz="0" w:val="nil"/>
-              <w:right w:color="000000" w:space="0" w:sz="0" w:val="nil"/>
-            </w:tcBorders>
-            <w:shd w:fill="1b365d" w:val="clear"/>
+              <w:top w:color="000000" w:space="0" w:sz="8" w:val="single"/>
+              <w:left w:color="000000" w:space="0" w:sz="8" w:val="single"/>
+              <w:bottom w:color="000000" w:space="0" w:sz="8" w:val="single"/>
+              <w:right w:color="000000" w:space="0" w:sz="8" w:val="single"/>
+            </w:tcBorders>
+            <w:shd w:fill="d9ead3" w:val="clear"/>
             <w:tcMar>
               <w:top w:w="100.0" w:type="dxa"/>
               <w:left w:w="100.0" w:type="dxa"/>
@@ -706,14 +779,18 @@
               <w:rPr>
                 <w:b w:val="1"/>
                 <w:bCs w:val="1"/>
-                <w:color w:val="ffffff"/>
-              </w:rPr>
-            </w:pPr>
-            <w:r>
-              <w:rPr>
-                <w:b w:val="1"/>
-                <w:bCs w:val="1"/>
-                <w:color w:val="ffffff"/>
+                <w:color w:val="434343"/>
+                <w:sz w:val="24"/>
+                <w:szCs w:val="24"/>
+              </w:rPr>
+            </w:pPr>
+            <w:r>
+              <w:rPr>
+                <w:b w:val="1"/>
+                <w:bCs w:val="1"/>
+                <w:color w:val="434343"/>
+                <w:sz w:val="24"/>
+                <w:szCs w:val="24"/>
                 <w:rtl w:val="0"/>
               </w:rPr>
               <w:t xml:space="preserve">Prioridad</w:t>
@@ -730,34 +807,38 @@
         <w:tc>
           <w:tcPr>
             <w:tcBorders>
-              <w:top w:color="000000" w:space="0" w:sz="0" w:val="nil"/>
-              <w:left w:color="000000" w:space="0" w:sz="0" w:val="nil"/>
-              <w:bottom w:color="000000" w:space="0" w:sz="0" w:val="nil"/>
-              <w:right w:color="000000" w:space="0" w:sz="0" w:val="nil"/>
-            </w:tcBorders>
-            <w:shd w:fill="ffffff" w:val="clear"/>
-            <w:tcMar>
-              <w:top w:w="80.0" w:type="dxa"/>
-              <w:left w:w="100.0" w:type="dxa"/>
-              <w:bottom w:w="80.0" w:type="dxa"/>
-              <w:right w:w="100.0" w:type="dxa"/>
-            </w:tcMar>
-            <w:vAlign w:val="top"/>
-          </w:tcPr>
-          <w:p>
-            <w:pPr>
-              <w:spacing w:after="200" w:before="220" w:lineRule="auto"/>
-              <w:rPr>
-                <w:b w:val="1"/>
-                <w:bCs w:val="1"/>
-                <w:color w:val="2d3748"/>
-              </w:rPr>
-            </w:pPr>
-            <w:r>
-              <w:rPr>
-                <w:b w:val="1"/>
-                <w:bCs w:val="1"/>
-                <w:color w:val="2d3748"/>
+              <w:top w:color="000000" w:space="0" w:sz="8" w:val="single"/>
+              <w:left w:color="000000" w:space="0" w:sz="8" w:val="single"/>
+              <w:bottom w:color="000000" w:space="0" w:sz="8" w:val="single"/>
+              <w:right w:color="000000" w:space="0" w:sz="8" w:val="single"/>
+            </w:tcBorders>
+            <w:shd w:fill="ffffff" w:val="clear"/>
+            <w:tcMar>
+              <w:top w:w="80.0" w:type="dxa"/>
+              <w:left w:w="100.0" w:type="dxa"/>
+              <w:bottom w:w="80.0" w:type="dxa"/>
+              <w:right w:w="100.0" w:type="dxa"/>
+            </w:tcMar>
+            <w:vAlign w:val="top"/>
+          </w:tcPr>
+          <w:p>
+            <w:pPr>
+              <w:spacing w:after="200" w:before="220" w:lineRule="auto"/>
+              <w:rPr>
+                <w:b w:val="1"/>
+                <w:bCs w:val="1"/>
+                <w:color w:val="434343"/>
+                <w:sz w:val="24"/>
+                <w:szCs w:val="24"/>
+              </w:rPr>
+            </w:pPr>
+            <w:r>
+              <w:rPr>
+                <w:b w:val="1"/>
+                <w:bCs w:val="1"/>
+                <w:color w:val="434343"/>
+                <w:sz w:val="24"/>
+                <w:szCs w:val="24"/>
                 <w:rtl w:val="0"/>
               </w:rPr>
               <w:t xml:space="preserve">RF-01</w:t>
@@ -767,30 +848,34 @@
         <w:tc>
           <w:tcPr>
             <w:tcBorders>
-              <w:top w:color="000000" w:space="0" w:sz="0" w:val="nil"/>
-              <w:left w:color="000000" w:space="0" w:sz="0" w:val="nil"/>
-              <w:bottom w:color="000000" w:space="0" w:sz="0" w:val="nil"/>
-              <w:right w:color="000000" w:space="0" w:sz="0" w:val="nil"/>
-            </w:tcBorders>
-            <w:shd w:fill="ffffff" w:val="clear"/>
-            <w:tcMar>
-              <w:top w:w="80.0" w:type="dxa"/>
-              <w:left w:w="100.0" w:type="dxa"/>
-              <w:bottom w:w="80.0" w:type="dxa"/>
-              <w:right w:w="100.0" w:type="dxa"/>
-            </w:tcMar>
-            <w:vAlign w:val="top"/>
-          </w:tcPr>
-          <w:p>
-            <w:pPr>
-              <w:spacing w:after="200" w:before="220" w:lineRule="auto"/>
-              <w:rPr>
-                <w:color w:val="2d3748"/>
-              </w:rPr>
-            </w:pPr>
-            <w:r>
-              <w:rPr>
-                <w:color w:val="2d3748"/>
+              <w:top w:color="000000" w:space="0" w:sz="8" w:val="single"/>
+              <w:left w:color="000000" w:space="0" w:sz="8" w:val="single"/>
+              <w:bottom w:color="000000" w:space="0" w:sz="8" w:val="single"/>
+              <w:right w:color="000000" w:space="0" w:sz="8" w:val="single"/>
+            </w:tcBorders>
+            <w:shd w:fill="ffffff" w:val="clear"/>
+            <w:tcMar>
+              <w:top w:w="80.0" w:type="dxa"/>
+              <w:left w:w="100.0" w:type="dxa"/>
+              <w:bottom w:w="80.0" w:type="dxa"/>
+              <w:right w:w="100.0" w:type="dxa"/>
+            </w:tcMar>
+            <w:vAlign w:val="top"/>
+          </w:tcPr>
+          <w:p>
+            <w:pPr>
+              <w:spacing w:after="200" w:before="220" w:lineRule="auto"/>
+              <w:rPr>
+                <w:color w:val="434343"/>
+                <w:sz w:val="24"/>
+                <w:szCs w:val="24"/>
+              </w:rPr>
+            </w:pPr>
+            <w:r>
+              <w:rPr>
+                <w:color w:val="434343"/>
+                <w:sz w:val="24"/>
+                <w:szCs w:val="24"/>
                 <w:rtl w:val="0"/>
               </w:rPr>
               <w:t xml:space="preserve">Catálogo de Materias</w:t>
@@ -800,30 +885,34 @@
         <w:tc>
           <w:tcPr>
             <w:tcBorders>
-              <w:top w:color="000000" w:space="0" w:sz="0" w:val="nil"/>
-              <w:left w:color="000000" w:space="0" w:sz="0" w:val="nil"/>
-              <w:bottom w:color="000000" w:space="0" w:sz="0" w:val="nil"/>
-              <w:right w:color="000000" w:space="0" w:sz="0" w:val="nil"/>
-            </w:tcBorders>
-            <w:shd w:fill="ffffff" w:val="clear"/>
-            <w:tcMar>
-              <w:top w:w="80.0" w:type="dxa"/>
-              <w:left w:w="100.0" w:type="dxa"/>
-              <w:bottom w:w="80.0" w:type="dxa"/>
-              <w:right w:w="100.0" w:type="dxa"/>
-            </w:tcMar>
-            <w:vAlign w:val="top"/>
-          </w:tcPr>
-          <w:p>
-            <w:pPr>
-              <w:spacing w:after="200" w:before="220" w:lineRule="auto"/>
-              <w:rPr>
-                <w:color w:val="2d3748"/>
-              </w:rPr>
-            </w:pPr>
-            <w:r>
-              <w:rPr>
-                <w:color w:val="2d3748"/>
+              <w:top w:color="000000" w:space="0" w:sz="8" w:val="single"/>
+              <w:left w:color="000000" w:space="0" w:sz="8" w:val="single"/>
+              <w:bottom w:color="000000" w:space="0" w:sz="8" w:val="single"/>
+              <w:right w:color="000000" w:space="0" w:sz="8" w:val="single"/>
+            </w:tcBorders>
+            <w:shd w:fill="ffffff" w:val="clear"/>
+            <w:tcMar>
+              <w:top w:w="80.0" w:type="dxa"/>
+              <w:left w:w="100.0" w:type="dxa"/>
+              <w:bottom w:w="80.0" w:type="dxa"/>
+              <w:right w:w="100.0" w:type="dxa"/>
+            </w:tcMar>
+            <w:vAlign w:val="top"/>
+          </w:tcPr>
+          <w:p>
+            <w:pPr>
+              <w:spacing w:after="200" w:before="220" w:lineRule="auto"/>
+              <w:rPr>
+                <w:color w:val="434343"/>
+                <w:sz w:val="24"/>
+                <w:szCs w:val="24"/>
+              </w:rPr>
+            </w:pPr>
+            <w:r>
+              <w:rPr>
+                <w:color w:val="434343"/>
+                <w:sz w:val="24"/>
+                <w:szCs w:val="24"/>
                 <w:rtl w:val="0"/>
               </w:rPr>
               <w:t xml:space="preserve">El sistema debe desplegar la lista estructurada de materias con su código, prerrequisitos, créditos y descripción.</w:t>
@@ -833,30 +922,34 @@
         <w:tc>
           <w:tcPr>
             <w:tcBorders>
-              <w:top w:color="000000" w:space="0" w:sz="0" w:val="nil"/>
-              <w:left w:color="000000" w:space="0" w:sz="0" w:val="nil"/>
-              <w:bottom w:color="000000" w:space="0" w:sz="0" w:val="nil"/>
-              <w:right w:color="000000" w:space="0" w:sz="0" w:val="nil"/>
-            </w:tcBorders>
-            <w:shd w:fill="ffffff" w:val="clear"/>
-            <w:tcMar>
-              <w:top w:w="80.0" w:type="dxa"/>
-              <w:left w:w="100.0" w:type="dxa"/>
-              <w:bottom w:w="80.0" w:type="dxa"/>
-              <w:right w:w="100.0" w:type="dxa"/>
-            </w:tcMar>
-            <w:vAlign w:val="top"/>
-          </w:tcPr>
-          <w:p>
-            <w:pPr>
-              <w:spacing w:after="200" w:before="220" w:lineRule="auto"/>
-              <w:rPr>
-                <w:color w:val="2d3748"/>
-              </w:rPr>
-            </w:pPr>
-            <w:r>
-              <w:rPr>
-                <w:color w:val="2d3748"/>
+              <w:top w:color="000000" w:space="0" w:sz="8" w:val="single"/>
+              <w:left w:color="000000" w:space="0" w:sz="8" w:val="single"/>
+              <w:bottom w:color="000000" w:space="0" w:sz="8" w:val="single"/>
+              <w:right w:color="000000" w:space="0" w:sz="8" w:val="single"/>
+            </w:tcBorders>
+            <w:shd w:fill="ffffff" w:val="clear"/>
+            <w:tcMar>
+              <w:top w:w="80.0" w:type="dxa"/>
+              <w:left w:w="100.0" w:type="dxa"/>
+              <w:bottom w:w="80.0" w:type="dxa"/>
+              <w:right w:w="100.0" w:type="dxa"/>
+            </w:tcMar>
+            <w:vAlign w:val="top"/>
+          </w:tcPr>
+          <w:p>
+            <w:pPr>
+              <w:spacing w:after="200" w:before="220" w:lineRule="auto"/>
+              <w:rPr>
+                <w:color w:val="434343"/>
+                <w:sz w:val="24"/>
+                <w:szCs w:val="24"/>
+              </w:rPr>
+            </w:pPr>
+            <w:r>
+              <w:rPr>
+                <w:color w:val="434343"/>
+                <w:sz w:val="24"/>
+                <w:szCs w:val="24"/>
                 <w:rtl w:val="0"/>
               </w:rPr>
               <w:t xml:space="preserve">Alta</w:t>
@@ -873,34 +966,38 @@
         <w:tc>
           <w:tcPr>
             <w:tcBorders>
-              <w:top w:color="000000" w:space="0" w:sz="0" w:val="nil"/>
-              <w:left w:color="000000" w:space="0" w:sz="0" w:val="nil"/>
-              <w:bottom w:color="000000" w:space="0" w:sz="0" w:val="nil"/>
-              <w:right w:color="000000" w:space="0" w:sz="0" w:val="nil"/>
-            </w:tcBorders>
-            <w:shd w:fill="f4f6f9" w:val="clear"/>
-            <w:tcMar>
-              <w:top w:w="80.0" w:type="dxa"/>
-              <w:left w:w="100.0" w:type="dxa"/>
-              <w:bottom w:w="80.0" w:type="dxa"/>
-              <w:right w:w="100.0" w:type="dxa"/>
-            </w:tcMar>
-            <w:vAlign w:val="top"/>
-          </w:tcPr>
-          <w:p>
-            <w:pPr>
-              <w:spacing w:after="200" w:before="220" w:lineRule="auto"/>
-              <w:rPr>
-                <w:b w:val="1"/>
-                <w:bCs w:val="1"/>
-                <w:color w:val="2d3748"/>
-              </w:rPr>
-            </w:pPr>
-            <w:r>
-              <w:rPr>
-                <w:b w:val="1"/>
-                <w:bCs w:val="1"/>
-                <w:color w:val="2d3748"/>
+              <w:top w:color="000000" w:space="0" w:sz="8" w:val="single"/>
+              <w:left w:color="000000" w:space="0" w:sz="8" w:val="single"/>
+              <w:bottom w:color="000000" w:space="0" w:sz="8" w:val="single"/>
+              <w:right w:color="000000" w:space="0" w:sz="8" w:val="single"/>
+            </w:tcBorders>
+            <w:shd w:fill="ffffff" w:val="clear"/>
+            <w:tcMar>
+              <w:top w:w="80.0" w:type="dxa"/>
+              <w:left w:w="100.0" w:type="dxa"/>
+              <w:bottom w:w="80.0" w:type="dxa"/>
+              <w:right w:w="100.0" w:type="dxa"/>
+            </w:tcMar>
+            <w:vAlign w:val="top"/>
+          </w:tcPr>
+          <w:p>
+            <w:pPr>
+              <w:spacing w:after="200" w:before="220" w:lineRule="auto"/>
+              <w:rPr>
+                <w:b w:val="1"/>
+                <w:bCs w:val="1"/>
+                <w:color w:val="434343"/>
+                <w:sz w:val="24"/>
+                <w:szCs w:val="24"/>
+              </w:rPr>
+            </w:pPr>
+            <w:r>
+              <w:rPr>
+                <w:b w:val="1"/>
+                <w:bCs w:val="1"/>
+                <w:color w:val="434343"/>
+                <w:sz w:val="24"/>
+                <w:szCs w:val="24"/>
                 <w:rtl w:val="0"/>
               </w:rPr>
               <w:t xml:space="preserve">RF-02</w:t>
@@ -910,30 +1007,34 @@
         <w:tc>
           <w:tcPr>
             <w:tcBorders>
-              <w:top w:color="000000" w:space="0" w:sz="0" w:val="nil"/>
-              <w:left w:color="000000" w:space="0" w:sz="0" w:val="nil"/>
-              <w:bottom w:color="000000" w:space="0" w:sz="0" w:val="nil"/>
-              <w:right w:color="000000" w:space="0" w:sz="0" w:val="nil"/>
-            </w:tcBorders>
-            <w:shd w:fill="f4f6f9" w:val="clear"/>
-            <w:tcMar>
-              <w:top w:w="80.0" w:type="dxa"/>
-              <w:left w:w="100.0" w:type="dxa"/>
-              <w:bottom w:w="80.0" w:type="dxa"/>
-              <w:right w:w="100.0" w:type="dxa"/>
-            </w:tcMar>
-            <w:vAlign w:val="top"/>
-          </w:tcPr>
-          <w:p>
-            <w:pPr>
-              <w:spacing w:after="200" w:before="220" w:lineRule="auto"/>
-              <w:rPr>
-                <w:color w:val="2d3748"/>
-              </w:rPr>
-            </w:pPr>
-            <w:r>
-              <w:rPr>
-                <w:color w:val="2d3748"/>
+              <w:top w:color="000000" w:space="0" w:sz="8" w:val="single"/>
+              <w:left w:color="000000" w:space="0" w:sz="8" w:val="single"/>
+              <w:bottom w:color="000000" w:space="0" w:sz="8" w:val="single"/>
+              <w:right w:color="000000" w:space="0" w:sz="8" w:val="single"/>
+            </w:tcBorders>
+            <w:shd w:fill="ffffff" w:val="clear"/>
+            <w:tcMar>
+              <w:top w:w="80.0" w:type="dxa"/>
+              <w:left w:w="100.0" w:type="dxa"/>
+              <w:bottom w:w="80.0" w:type="dxa"/>
+              <w:right w:w="100.0" w:type="dxa"/>
+            </w:tcMar>
+            <w:vAlign w:val="top"/>
+          </w:tcPr>
+          <w:p>
+            <w:pPr>
+              <w:spacing w:after="200" w:before="220" w:lineRule="auto"/>
+              <w:rPr>
+                <w:color w:val="434343"/>
+                <w:sz w:val="24"/>
+                <w:szCs w:val="24"/>
+              </w:rPr>
+            </w:pPr>
+            <w:r>
+              <w:rPr>
+                <w:color w:val="434343"/>
+                <w:sz w:val="24"/>
+                <w:szCs w:val="24"/>
                 <w:rtl w:val="0"/>
               </w:rPr>
               <w:t xml:space="preserve">Horarios y Aulas</w:t>
@@ -943,30 +1044,34 @@
         <w:tc>
           <w:tcPr>
             <w:tcBorders>
-              <w:top w:color="000000" w:space="0" w:sz="0" w:val="nil"/>
-              <w:left w:color="000000" w:space="0" w:sz="0" w:val="nil"/>
-              <w:bottom w:color="000000" w:space="0" w:sz="0" w:val="nil"/>
-              <w:right w:color="000000" w:space="0" w:sz="0" w:val="nil"/>
-            </w:tcBorders>
-            <w:shd w:fill="f4f6f9" w:val="clear"/>
-            <w:tcMar>
-              <w:top w:w="80.0" w:type="dxa"/>
-              <w:left w:w="100.0" w:type="dxa"/>
-              <w:bottom w:w="80.0" w:type="dxa"/>
-              <w:right w:w="100.0" w:type="dxa"/>
-            </w:tcMar>
-            <w:vAlign w:val="top"/>
-          </w:tcPr>
-          <w:p>
-            <w:pPr>
-              <w:spacing w:after="200" w:before="220" w:lineRule="auto"/>
-              <w:rPr>
-                <w:color w:val="2d3748"/>
-              </w:rPr>
-            </w:pPr>
-            <w:r>
-              <w:rPr>
-                <w:color w:val="2d3748"/>
+              <w:top w:color="000000" w:space="0" w:sz="8" w:val="single"/>
+              <w:left w:color="000000" w:space="0" w:sz="8" w:val="single"/>
+              <w:bottom w:color="000000" w:space="0" w:sz="8" w:val="single"/>
+              <w:right w:color="000000" w:space="0" w:sz="8" w:val="single"/>
+            </w:tcBorders>
+            <w:shd w:fill="ffffff" w:val="clear"/>
+            <w:tcMar>
+              <w:top w:w="80.0" w:type="dxa"/>
+              <w:left w:w="100.0" w:type="dxa"/>
+              <w:bottom w:w="80.0" w:type="dxa"/>
+              <w:right w:w="100.0" w:type="dxa"/>
+            </w:tcMar>
+            <w:vAlign w:val="top"/>
+          </w:tcPr>
+          <w:p>
+            <w:pPr>
+              <w:spacing w:after="200" w:before="220" w:lineRule="auto"/>
+              <w:rPr>
+                <w:color w:val="434343"/>
+                <w:sz w:val="24"/>
+                <w:szCs w:val="24"/>
+              </w:rPr>
+            </w:pPr>
+            <w:r>
+              <w:rPr>
+                <w:color w:val="434343"/>
+                <w:sz w:val="24"/>
+                <w:szCs w:val="24"/>
                 <w:rtl w:val="0"/>
               </w:rPr>
               <w:t xml:space="preserve">El sistema debe permitir consultar la parrilla de clases asignadas especificando días, rango horario y aula.</w:t>
@@ -976,30 +1081,34 @@
         <w:tc>
           <w:tcPr>
             <w:tcBorders>
-              <w:top w:color="000000" w:space="0" w:sz="0" w:val="nil"/>
-              <w:left w:color="000000" w:space="0" w:sz="0" w:val="nil"/>
-              <w:bottom w:color="000000" w:space="0" w:sz="0" w:val="nil"/>
-              <w:right w:color="000000" w:space="0" w:sz="0" w:val="nil"/>
-            </w:tcBorders>
-            <w:shd w:fill="f4f6f9" w:val="clear"/>
-            <w:tcMar>
-              <w:top w:w="80.0" w:type="dxa"/>
-              <w:left w:w="100.0" w:type="dxa"/>
-              <w:bottom w:w="80.0" w:type="dxa"/>
-              <w:right w:w="100.0" w:type="dxa"/>
-            </w:tcMar>
-            <w:vAlign w:val="top"/>
-          </w:tcPr>
-          <w:p>
-            <w:pPr>
-              <w:spacing w:after="200" w:before="220" w:lineRule="auto"/>
-              <w:rPr>
-                <w:color w:val="2d3748"/>
-              </w:rPr>
-            </w:pPr>
-            <w:r>
-              <w:rPr>
-                <w:color w:val="2d3748"/>
+              <w:top w:color="000000" w:space="0" w:sz="8" w:val="single"/>
+              <w:left w:color="000000" w:space="0" w:sz="8" w:val="single"/>
+              <w:bottom w:color="000000" w:space="0" w:sz="8" w:val="single"/>
+              <w:right w:color="000000" w:space="0" w:sz="8" w:val="single"/>
+            </w:tcBorders>
+            <w:shd w:fill="ffffff" w:val="clear"/>
+            <w:tcMar>
+              <w:top w:w="80.0" w:type="dxa"/>
+              <w:left w:w="100.0" w:type="dxa"/>
+              <w:bottom w:w="80.0" w:type="dxa"/>
+              <w:right w:w="100.0" w:type="dxa"/>
+            </w:tcMar>
+            <w:vAlign w:val="top"/>
+          </w:tcPr>
+          <w:p>
+            <w:pPr>
+              <w:spacing w:after="200" w:before="220" w:lineRule="auto"/>
+              <w:rPr>
+                <w:color w:val="434343"/>
+                <w:sz w:val="24"/>
+                <w:szCs w:val="24"/>
+              </w:rPr>
+            </w:pPr>
+            <w:r>
+              <w:rPr>
+                <w:color w:val="434343"/>
+                <w:sz w:val="24"/>
+                <w:szCs w:val="24"/>
                 <w:rtl w:val="0"/>
               </w:rPr>
               <w:t xml:space="preserve">Alta</w:t>
@@ -1016,34 +1125,38 @@
         <w:tc>
           <w:tcPr>
             <w:tcBorders>
-              <w:top w:color="000000" w:space="0" w:sz="0" w:val="nil"/>
-              <w:left w:color="000000" w:space="0" w:sz="0" w:val="nil"/>
-              <w:bottom w:color="000000" w:space="0" w:sz="0" w:val="nil"/>
-              <w:right w:color="000000" w:space="0" w:sz="0" w:val="nil"/>
-            </w:tcBorders>
-            <w:shd w:fill="ffffff" w:val="clear"/>
-            <w:tcMar>
-              <w:top w:w="80.0" w:type="dxa"/>
-              <w:left w:w="100.0" w:type="dxa"/>
-              <w:bottom w:w="80.0" w:type="dxa"/>
-              <w:right w:w="100.0" w:type="dxa"/>
-            </w:tcMar>
-            <w:vAlign w:val="top"/>
-          </w:tcPr>
-          <w:p>
-            <w:pPr>
-              <w:spacing w:after="200" w:before="220" w:lineRule="auto"/>
-              <w:rPr>
-                <w:b w:val="1"/>
-                <w:bCs w:val="1"/>
-                <w:color w:val="2d3748"/>
-              </w:rPr>
-            </w:pPr>
-            <w:r>
-              <w:rPr>
-                <w:b w:val="1"/>
-                <w:bCs w:val="1"/>
-                <w:color w:val="2d3748"/>
+              <w:top w:color="000000" w:space="0" w:sz="8" w:val="single"/>
+              <w:left w:color="000000" w:space="0" w:sz="8" w:val="single"/>
+              <w:bottom w:color="000000" w:space="0" w:sz="8" w:val="single"/>
+              <w:right w:color="000000" w:space="0" w:sz="8" w:val="single"/>
+            </w:tcBorders>
+            <w:shd w:fill="ffffff" w:val="clear"/>
+            <w:tcMar>
+              <w:top w:w="80.0" w:type="dxa"/>
+              <w:left w:w="100.0" w:type="dxa"/>
+              <w:bottom w:w="80.0" w:type="dxa"/>
+              <w:right w:w="100.0" w:type="dxa"/>
+            </w:tcMar>
+            <w:vAlign w:val="top"/>
+          </w:tcPr>
+          <w:p>
+            <w:pPr>
+              <w:spacing w:after="200" w:before="220" w:lineRule="auto"/>
+              <w:rPr>
+                <w:b w:val="1"/>
+                <w:bCs w:val="1"/>
+                <w:color w:val="434343"/>
+                <w:sz w:val="24"/>
+                <w:szCs w:val="24"/>
+              </w:rPr>
+            </w:pPr>
+            <w:r>
+              <w:rPr>
+                <w:b w:val="1"/>
+                <w:bCs w:val="1"/>
+                <w:color w:val="434343"/>
+                <w:sz w:val="24"/>
+                <w:szCs w:val="24"/>
                 <w:rtl w:val="0"/>
               </w:rPr>
               <w:t xml:space="preserve">RF-03</w:t>
@@ -1053,30 +1166,34 @@
         <w:tc>
           <w:tcPr>
             <w:tcBorders>
-              <w:top w:color="000000" w:space="0" w:sz="0" w:val="nil"/>
-              <w:left w:color="000000" w:space="0" w:sz="0" w:val="nil"/>
-              <w:bottom w:color="000000" w:space="0" w:sz="0" w:val="nil"/>
-              <w:right w:color="000000" w:space="0" w:sz="0" w:val="nil"/>
-            </w:tcBorders>
-            <w:shd w:fill="ffffff" w:val="clear"/>
-            <w:tcMar>
-              <w:top w:w="80.0" w:type="dxa"/>
-              <w:left w:w="100.0" w:type="dxa"/>
-              <w:bottom w:w="80.0" w:type="dxa"/>
-              <w:right w:w="100.0" w:type="dxa"/>
-            </w:tcMar>
-            <w:vAlign w:val="top"/>
-          </w:tcPr>
-          <w:p>
-            <w:pPr>
-              <w:spacing w:after="200" w:before="220" w:lineRule="auto"/>
-              <w:rPr>
-                <w:color w:val="2d3748"/>
-              </w:rPr>
-            </w:pPr>
-            <w:r>
-              <w:rPr>
-                <w:color w:val="2d3748"/>
+              <w:top w:color="000000" w:space="0" w:sz="8" w:val="single"/>
+              <w:left w:color="000000" w:space="0" w:sz="8" w:val="single"/>
+              <w:bottom w:color="000000" w:space="0" w:sz="8" w:val="single"/>
+              <w:right w:color="000000" w:space="0" w:sz="8" w:val="single"/>
+            </w:tcBorders>
+            <w:shd w:fill="ffffff" w:val="clear"/>
+            <w:tcMar>
+              <w:top w:w="80.0" w:type="dxa"/>
+              <w:left w:w="100.0" w:type="dxa"/>
+              <w:bottom w:w="80.0" w:type="dxa"/>
+              <w:right w:w="100.0" w:type="dxa"/>
+            </w:tcMar>
+            <w:vAlign w:val="top"/>
+          </w:tcPr>
+          <w:p>
+            <w:pPr>
+              <w:spacing w:after="200" w:before="220" w:lineRule="auto"/>
+              <w:rPr>
+                <w:color w:val="434343"/>
+                <w:sz w:val="24"/>
+                <w:szCs w:val="24"/>
+              </w:rPr>
+            </w:pPr>
+            <w:r>
+              <w:rPr>
+                <w:color w:val="434343"/>
+                <w:sz w:val="24"/>
+                <w:szCs w:val="24"/>
                 <w:rtl w:val="0"/>
               </w:rPr>
               <w:t xml:space="preserve">Buscador Dinámico</w:t>
@@ -1086,30 +1203,34 @@
         <w:tc>
           <w:tcPr>
             <w:tcBorders>
-              <w:top w:color="000000" w:space="0" w:sz="0" w:val="nil"/>
-              <w:left w:color="000000" w:space="0" w:sz="0" w:val="nil"/>
-              <w:bottom w:color="000000" w:space="0" w:sz="0" w:val="nil"/>
-              <w:right w:color="000000" w:space="0" w:sz="0" w:val="nil"/>
-            </w:tcBorders>
-            <w:shd w:fill="ffffff" w:val="clear"/>
-            <w:tcMar>
-              <w:top w:w="80.0" w:type="dxa"/>
-              <w:left w:w="100.0" w:type="dxa"/>
-              <w:bottom w:w="80.0" w:type="dxa"/>
-              <w:right w:w="100.0" w:type="dxa"/>
-            </w:tcMar>
-            <w:vAlign w:val="top"/>
-          </w:tcPr>
-          <w:p>
-            <w:pPr>
-              <w:spacing w:after="200" w:before="220" w:lineRule="auto"/>
-              <w:rPr>
-                <w:color w:val="2d3748"/>
-              </w:rPr>
-            </w:pPr>
-            <w:r>
-              <w:rPr>
-                <w:color w:val="2d3748"/>
+              <w:top w:color="000000" w:space="0" w:sz="8" w:val="single"/>
+              <w:left w:color="000000" w:space="0" w:sz="8" w:val="single"/>
+              <w:bottom w:color="000000" w:space="0" w:sz="8" w:val="single"/>
+              <w:right w:color="000000" w:space="0" w:sz="8" w:val="single"/>
+            </w:tcBorders>
+            <w:shd w:fill="ffffff" w:val="clear"/>
+            <w:tcMar>
+              <w:top w:w="80.0" w:type="dxa"/>
+              <w:left w:w="100.0" w:type="dxa"/>
+              <w:bottom w:w="80.0" w:type="dxa"/>
+              <w:right w:w="100.0" w:type="dxa"/>
+            </w:tcMar>
+            <w:vAlign w:val="top"/>
+          </w:tcPr>
+          <w:p>
+            <w:pPr>
+              <w:spacing w:after="200" w:before="220" w:lineRule="auto"/>
+              <w:rPr>
+                <w:color w:val="434343"/>
+                <w:sz w:val="24"/>
+                <w:szCs w:val="24"/>
+              </w:rPr>
+            </w:pPr>
+            <w:r>
+              <w:rPr>
+                <w:color w:val="434343"/>
+                <w:sz w:val="24"/>
+                <w:szCs w:val="24"/>
                 <w:rtl w:val="0"/>
               </w:rPr>
               <w:t xml:space="preserve">El sistema permitirá filtrar la lista de materias en tiempo real desde el cliente frontend.</w:t>
@@ -1119,30 +1240,34 @@
         <w:tc>
           <w:tcPr>
             <w:tcBorders>
-              <w:top w:color="000000" w:space="0" w:sz="0" w:val="nil"/>
-              <w:left w:color="000000" w:space="0" w:sz="0" w:val="nil"/>
-              <w:bottom w:color="000000" w:space="0" w:sz="0" w:val="nil"/>
-              <w:right w:color="000000" w:space="0" w:sz="0" w:val="nil"/>
-            </w:tcBorders>
-            <w:shd w:fill="ffffff" w:val="clear"/>
-            <w:tcMar>
-              <w:top w:w="80.0" w:type="dxa"/>
-              <w:left w:w="100.0" w:type="dxa"/>
-              <w:bottom w:w="80.0" w:type="dxa"/>
-              <w:right w:w="100.0" w:type="dxa"/>
-            </w:tcMar>
-            <w:vAlign w:val="top"/>
-          </w:tcPr>
-          <w:p>
-            <w:pPr>
-              <w:spacing w:after="200" w:before="220" w:lineRule="auto"/>
-              <w:rPr>
-                <w:color w:val="2d3748"/>
-              </w:rPr>
-            </w:pPr>
-            <w:r>
-              <w:rPr>
-                <w:color w:val="2d3748"/>
+              <w:top w:color="000000" w:space="0" w:sz="8" w:val="single"/>
+              <w:left w:color="000000" w:space="0" w:sz="8" w:val="single"/>
+              <w:bottom w:color="000000" w:space="0" w:sz="8" w:val="single"/>
+              <w:right w:color="000000" w:space="0" w:sz="8" w:val="single"/>
+            </w:tcBorders>
+            <w:shd w:fill="ffffff" w:val="clear"/>
+            <w:tcMar>
+              <w:top w:w="80.0" w:type="dxa"/>
+              <w:left w:w="100.0" w:type="dxa"/>
+              <w:bottom w:w="80.0" w:type="dxa"/>
+              <w:right w:w="100.0" w:type="dxa"/>
+            </w:tcMar>
+            <w:vAlign w:val="top"/>
+          </w:tcPr>
+          <w:p>
+            <w:pPr>
+              <w:spacing w:after="200" w:before="220" w:lineRule="auto"/>
+              <w:rPr>
+                <w:color w:val="434343"/>
+                <w:sz w:val="24"/>
+                <w:szCs w:val="24"/>
+              </w:rPr>
+            </w:pPr>
+            <w:r>
+              <w:rPr>
+                <w:color w:val="434343"/>
+                <w:sz w:val="24"/>
+                <w:szCs w:val="24"/>
                 <w:rtl w:val="0"/>
               </w:rPr>
               <w:t xml:space="preserve">Media</w:t>
@@ -1159,34 +1284,38 @@
         <w:tc>
           <w:tcPr>
             <w:tcBorders>
-              <w:top w:color="000000" w:space="0" w:sz="0" w:val="nil"/>
-              <w:left w:color="000000" w:space="0" w:sz="0" w:val="nil"/>
-              <w:bottom w:color="000000" w:space="0" w:sz="0" w:val="nil"/>
-              <w:right w:color="000000" w:space="0" w:sz="0" w:val="nil"/>
-            </w:tcBorders>
-            <w:shd w:fill="f4f6f9" w:val="clear"/>
-            <w:tcMar>
-              <w:top w:w="80.0" w:type="dxa"/>
-              <w:left w:w="100.0" w:type="dxa"/>
-              <w:bottom w:w="80.0" w:type="dxa"/>
-              <w:right w:w="100.0" w:type="dxa"/>
-            </w:tcMar>
-            <w:vAlign w:val="top"/>
-          </w:tcPr>
-          <w:p>
-            <w:pPr>
-              <w:spacing w:after="200" w:before="220" w:lineRule="auto"/>
-              <w:rPr>
-                <w:b w:val="1"/>
-                <w:bCs w:val="1"/>
-                <w:color w:val="2d3748"/>
-              </w:rPr>
-            </w:pPr>
-            <w:r>
-              <w:rPr>
-                <w:b w:val="1"/>
-                <w:bCs w:val="1"/>
-                <w:color w:val="2d3748"/>
+              <w:top w:color="000000" w:space="0" w:sz="8" w:val="single"/>
+              <w:left w:color="000000" w:space="0" w:sz="8" w:val="single"/>
+              <w:bottom w:color="000000" w:space="0" w:sz="8" w:val="single"/>
+              <w:right w:color="000000" w:space="0" w:sz="8" w:val="single"/>
+            </w:tcBorders>
+            <w:shd w:fill="ffffff" w:val="clear"/>
+            <w:tcMar>
+              <w:top w:w="80.0" w:type="dxa"/>
+              <w:left w:w="100.0" w:type="dxa"/>
+              <w:bottom w:w="80.0" w:type="dxa"/>
+              <w:right w:w="100.0" w:type="dxa"/>
+            </w:tcMar>
+            <w:vAlign w:val="top"/>
+          </w:tcPr>
+          <w:p>
+            <w:pPr>
+              <w:spacing w:after="200" w:before="220" w:lineRule="auto"/>
+              <w:rPr>
+                <w:b w:val="1"/>
+                <w:bCs w:val="1"/>
+                <w:color w:val="434343"/>
+                <w:sz w:val="24"/>
+                <w:szCs w:val="24"/>
+              </w:rPr>
+            </w:pPr>
+            <w:r>
+              <w:rPr>
+                <w:b w:val="1"/>
+                <w:bCs w:val="1"/>
+                <w:color w:val="434343"/>
+                <w:sz w:val="24"/>
+                <w:szCs w:val="24"/>
                 <w:rtl w:val="0"/>
               </w:rPr>
               <w:t xml:space="preserve">RF-04</w:t>
@@ -1196,30 +1325,34 @@
         <w:tc>
           <w:tcPr>
             <w:tcBorders>
-              <w:top w:color="000000" w:space="0" w:sz="0" w:val="nil"/>
-              <w:left w:color="000000" w:space="0" w:sz="0" w:val="nil"/>
-              <w:bottom w:color="000000" w:space="0" w:sz="0" w:val="nil"/>
-              <w:right w:color="000000" w:space="0" w:sz="0" w:val="nil"/>
-            </w:tcBorders>
-            <w:shd w:fill="f4f6f9" w:val="clear"/>
-            <w:tcMar>
-              <w:top w:w="80.0" w:type="dxa"/>
-              <w:left w:w="100.0" w:type="dxa"/>
-              <w:bottom w:w="80.0" w:type="dxa"/>
-              <w:right w:w="100.0" w:type="dxa"/>
-            </w:tcMar>
-            <w:vAlign w:val="top"/>
-          </w:tcPr>
-          <w:p>
-            <w:pPr>
-              <w:spacing w:after="200" w:before="220" w:lineRule="auto"/>
-              <w:rPr>
-                <w:color w:val="2d3748"/>
-              </w:rPr>
-            </w:pPr>
-            <w:r>
-              <w:rPr>
-                <w:color w:val="2d3748"/>
+              <w:top w:color="000000" w:space="0" w:sz="8" w:val="single"/>
+              <w:left w:color="000000" w:space="0" w:sz="8" w:val="single"/>
+              <w:bottom w:color="000000" w:space="0" w:sz="8" w:val="single"/>
+              <w:right w:color="000000" w:space="0" w:sz="8" w:val="single"/>
+            </w:tcBorders>
+            <w:shd w:fill="ffffff" w:val="clear"/>
+            <w:tcMar>
+              <w:top w:w="80.0" w:type="dxa"/>
+              <w:left w:w="100.0" w:type="dxa"/>
+              <w:bottom w:w="80.0" w:type="dxa"/>
+              <w:right w:w="100.0" w:type="dxa"/>
+            </w:tcMar>
+            <w:vAlign w:val="top"/>
+          </w:tcPr>
+          <w:p>
+            <w:pPr>
+              <w:spacing w:after="200" w:before="220" w:lineRule="auto"/>
+              <w:rPr>
+                <w:color w:val="434343"/>
+                <w:sz w:val="24"/>
+                <w:szCs w:val="24"/>
+              </w:rPr>
+            </w:pPr>
+            <w:r>
+              <w:rPr>
+                <w:color w:val="434343"/>
+                <w:sz w:val="24"/>
+                <w:szCs w:val="24"/>
                 <w:rtl w:val="0"/>
               </w:rPr>
               <w:t xml:space="preserve">Directorio Docente</w:t>
@@ -1229,30 +1362,34 @@
         <w:tc>
           <w:tcPr>
             <w:tcBorders>
-              <w:top w:color="000000" w:space="0" w:sz="0" w:val="nil"/>
-              <w:left w:color="000000" w:space="0" w:sz="0" w:val="nil"/>
-              <w:bottom w:color="000000" w:space="0" w:sz="0" w:val="nil"/>
-              <w:right w:color="000000" w:space="0" w:sz="0" w:val="nil"/>
-            </w:tcBorders>
-            <w:shd w:fill="f4f6f9" w:val="clear"/>
-            <w:tcMar>
-              <w:top w:w="80.0" w:type="dxa"/>
-              <w:left w:w="100.0" w:type="dxa"/>
-              <w:bottom w:w="80.0" w:type="dxa"/>
-              <w:right w:w="100.0" w:type="dxa"/>
-            </w:tcMar>
-            <w:vAlign w:val="top"/>
-          </w:tcPr>
-          <w:p>
-            <w:pPr>
-              <w:spacing w:after="200" w:before="220" w:lineRule="auto"/>
-              <w:rPr>
-                <w:color w:val="2d3748"/>
-              </w:rPr>
-            </w:pPr>
-            <w:r>
-              <w:rPr>
-                <w:color w:val="2d3748"/>
+              <w:top w:color="000000" w:space="0" w:sz="8" w:val="single"/>
+              <w:left w:color="000000" w:space="0" w:sz="8" w:val="single"/>
+              <w:bottom w:color="000000" w:space="0" w:sz="8" w:val="single"/>
+              <w:right w:color="000000" w:space="0" w:sz="8" w:val="single"/>
+            </w:tcBorders>
+            <w:shd w:fill="ffffff" w:val="clear"/>
+            <w:tcMar>
+              <w:top w:w="80.0" w:type="dxa"/>
+              <w:left w:w="100.0" w:type="dxa"/>
+              <w:bottom w:w="80.0" w:type="dxa"/>
+              <w:right w:w="100.0" w:type="dxa"/>
+            </w:tcMar>
+            <w:vAlign w:val="top"/>
+          </w:tcPr>
+          <w:p>
+            <w:pPr>
+              <w:spacing w:after="200" w:before="220" w:lineRule="auto"/>
+              <w:rPr>
+                <w:color w:val="434343"/>
+                <w:sz w:val="24"/>
+                <w:szCs w:val="24"/>
+              </w:rPr>
+            </w:pPr>
+            <w:r>
+              <w:rPr>
+                <w:color w:val="434343"/>
+                <w:sz w:val="24"/>
+                <w:szCs w:val="24"/>
                 <w:rtl w:val="0"/>
               </w:rPr>
               <w:t xml:space="preserve">Presentación de la lista de profesores asignados a las asignaturas con su contacto institucional.</w:t>
@@ -1262,30 +1399,34 @@
         <w:tc>
           <w:tcPr>
             <w:tcBorders>
-              <w:top w:color="000000" w:space="0" w:sz="0" w:val="nil"/>
-              <w:left w:color="000000" w:space="0" w:sz="0" w:val="nil"/>
-              <w:bottom w:color="000000" w:space="0" w:sz="0" w:val="nil"/>
-              <w:right w:color="000000" w:space="0" w:sz="0" w:val="nil"/>
-            </w:tcBorders>
-            <w:shd w:fill="f4f6f9" w:val="clear"/>
-            <w:tcMar>
-              <w:top w:w="80.0" w:type="dxa"/>
-              <w:left w:w="100.0" w:type="dxa"/>
-              <w:bottom w:w="80.0" w:type="dxa"/>
-              <w:right w:w="100.0" w:type="dxa"/>
-            </w:tcMar>
-            <w:vAlign w:val="top"/>
-          </w:tcPr>
-          <w:p>
-            <w:pPr>
-              <w:spacing w:after="200" w:before="220" w:lineRule="auto"/>
-              <w:rPr>
-                <w:color w:val="2d3748"/>
-              </w:rPr>
-            </w:pPr>
-            <w:r>
-              <w:rPr>
-                <w:color w:val="2d3748"/>
+              <w:top w:color="000000" w:space="0" w:sz="8" w:val="single"/>
+              <w:left w:color="000000" w:space="0" w:sz="8" w:val="single"/>
+              <w:bottom w:color="000000" w:space="0" w:sz="8" w:val="single"/>
+              <w:right w:color="000000" w:space="0" w:sz="8" w:val="single"/>
+            </w:tcBorders>
+            <w:shd w:fill="ffffff" w:val="clear"/>
+            <w:tcMar>
+              <w:top w:w="80.0" w:type="dxa"/>
+              <w:left w:w="100.0" w:type="dxa"/>
+              <w:bottom w:w="80.0" w:type="dxa"/>
+              <w:right w:w="100.0" w:type="dxa"/>
+            </w:tcMar>
+            <w:vAlign w:val="top"/>
+          </w:tcPr>
+          <w:p>
+            <w:pPr>
+              <w:spacing w:after="200" w:before="220" w:lineRule="auto"/>
+              <w:rPr>
+                <w:color w:val="434343"/>
+                <w:sz w:val="24"/>
+                <w:szCs w:val="24"/>
+              </w:rPr>
+            </w:pPr>
+            <w:r>
+              <w:rPr>
+                <w:color w:val="434343"/>
+                <w:sz w:val="24"/>
+                <w:szCs w:val="24"/>
                 <w:rtl w:val="0"/>
               </w:rPr>
               <w:t xml:space="preserve">Media</w:t>
@@ -1302,34 +1443,38 @@
         <w:tc>
           <w:tcPr>
             <w:tcBorders>
-              <w:top w:color="000000" w:space="0" w:sz="0" w:val="nil"/>
-              <w:left w:color="000000" w:space="0" w:sz="0" w:val="nil"/>
-              <w:bottom w:color="000000" w:space="0" w:sz="0" w:val="nil"/>
-              <w:right w:color="000000" w:space="0" w:sz="0" w:val="nil"/>
-            </w:tcBorders>
-            <w:shd w:fill="ffffff" w:val="clear"/>
-            <w:tcMar>
-              <w:top w:w="80.0" w:type="dxa"/>
-              <w:left w:w="100.0" w:type="dxa"/>
-              <w:bottom w:w="80.0" w:type="dxa"/>
-              <w:right w:w="100.0" w:type="dxa"/>
-            </w:tcMar>
-            <w:vAlign w:val="top"/>
-          </w:tcPr>
-          <w:p>
-            <w:pPr>
-              <w:spacing w:after="200" w:before="220" w:lineRule="auto"/>
-              <w:rPr>
-                <w:b w:val="1"/>
-                <w:bCs w:val="1"/>
-                <w:color w:val="2d3748"/>
-              </w:rPr>
-            </w:pPr>
-            <w:r>
-              <w:rPr>
-                <w:b w:val="1"/>
-                <w:bCs w:val="1"/>
-                <w:color w:val="2d3748"/>
+              <w:top w:color="000000" w:space="0" w:sz="8" w:val="single"/>
+              <w:left w:color="000000" w:space="0" w:sz="8" w:val="single"/>
+              <w:bottom w:color="000000" w:space="0" w:sz="8" w:val="single"/>
+              <w:right w:color="000000" w:space="0" w:sz="8" w:val="single"/>
+            </w:tcBorders>
+            <w:shd w:fill="ffffff" w:val="clear"/>
+            <w:tcMar>
+              <w:top w:w="80.0" w:type="dxa"/>
+              <w:left w:w="100.0" w:type="dxa"/>
+              <w:bottom w:w="80.0" w:type="dxa"/>
+              <w:right w:w="100.0" w:type="dxa"/>
+            </w:tcMar>
+            <w:vAlign w:val="top"/>
+          </w:tcPr>
+          <w:p>
+            <w:pPr>
+              <w:spacing w:after="200" w:before="220" w:lineRule="auto"/>
+              <w:rPr>
+                <w:b w:val="1"/>
+                <w:bCs w:val="1"/>
+                <w:color w:val="434343"/>
+                <w:sz w:val="24"/>
+                <w:szCs w:val="24"/>
+              </w:rPr>
+            </w:pPr>
+            <w:r>
+              <w:rPr>
+                <w:b w:val="1"/>
+                <w:bCs w:val="1"/>
+                <w:color w:val="434343"/>
+                <w:sz w:val="24"/>
+                <w:szCs w:val="24"/>
                 <w:rtl w:val="0"/>
               </w:rPr>
               <w:t xml:space="preserve">RF-05</w:t>
@@ -1339,30 +1484,34 @@
         <w:tc>
           <w:tcPr>
             <w:tcBorders>
-              <w:top w:color="000000" w:space="0" w:sz="0" w:val="nil"/>
-              <w:left w:color="000000" w:space="0" w:sz="0" w:val="nil"/>
-              <w:bottom w:color="000000" w:space="0" w:sz="0" w:val="nil"/>
-              <w:right w:color="000000" w:space="0" w:sz="0" w:val="nil"/>
-            </w:tcBorders>
-            <w:shd w:fill="ffffff" w:val="clear"/>
-            <w:tcMar>
-              <w:top w:w="80.0" w:type="dxa"/>
-              <w:left w:w="100.0" w:type="dxa"/>
-              <w:bottom w:w="80.0" w:type="dxa"/>
-              <w:right w:w="100.0" w:type="dxa"/>
-            </w:tcMar>
-            <w:vAlign w:val="top"/>
-          </w:tcPr>
-          <w:p>
-            <w:pPr>
-              <w:spacing w:after="200" w:before="220" w:lineRule="auto"/>
-              <w:rPr>
-                <w:color w:val="2d3748"/>
-              </w:rPr>
-            </w:pPr>
-            <w:r>
-              <w:rPr>
-                <w:color w:val="2d3748"/>
+              <w:top w:color="000000" w:space="0" w:sz="8" w:val="single"/>
+              <w:left w:color="000000" w:space="0" w:sz="8" w:val="single"/>
+              <w:bottom w:color="000000" w:space="0" w:sz="8" w:val="single"/>
+              <w:right w:color="000000" w:space="0" w:sz="8" w:val="single"/>
+            </w:tcBorders>
+            <w:shd w:fill="ffffff" w:val="clear"/>
+            <w:tcMar>
+              <w:top w:w="80.0" w:type="dxa"/>
+              <w:left w:w="100.0" w:type="dxa"/>
+              <w:bottom w:w="80.0" w:type="dxa"/>
+              <w:right w:w="100.0" w:type="dxa"/>
+            </w:tcMar>
+            <w:vAlign w:val="top"/>
+          </w:tcPr>
+          <w:p>
+            <w:pPr>
+              <w:spacing w:after="200" w:before="220" w:lineRule="auto"/>
+              <w:rPr>
+                <w:color w:val="434343"/>
+                <w:sz w:val="24"/>
+                <w:szCs w:val="24"/>
+              </w:rPr>
+            </w:pPr>
+            <w:r>
+              <w:rPr>
+                <w:color w:val="434343"/>
+                <w:sz w:val="24"/>
+                <w:szCs w:val="24"/>
                 <w:rtl w:val="0"/>
               </w:rPr>
               <w:t xml:space="preserve">Calendario Académico</w:t>
@@ -1372,30 +1521,34 @@
         <w:tc>
           <w:tcPr>
             <w:tcBorders>
-              <w:top w:color="000000" w:space="0" w:sz="0" w:val="nil"/>
-              <w:left w:color="000000" w:space="0" w:sz="0" w:val="nil"/>
-              <w:bottom w:color="000000" w:space="0" w:sz="0" w:val="nil"/>
-              <w:right w:color="000000" w:space="0" w:sz="0" w:val="nil"/>
-            </w:tcBorders>
-            <w:shd w:fill="ffffff" w:val="clear"/>
-            <w:tcMar>
-              <w:top w:w="80.0" w:type="dxa"/>
-              <w:left w:w="100.0" w:type="dxa"/>
-              <w:bottom w:w="80.0" w:type="dxa"/>
-              <w:right w:w="100.0" w:type="dxa"/>
-            </w:tcMar>
-            <w:vAlign w:val="top"/>
-          </w:tcPr>
-          <w:p>
-            <w:pPr>
-              <w:spacing w:after="200" w:before="220" w:lineRule="auto"/>
-              <w:rPr>
-                <w:color w:val="2d3748"/>
-              </w:rPr>
-            </w:pPr>
-            <w:r>
-              <w:rPr>
-                <w:color w:val="2d3748"/>
+              <w:top w:color="000000" w:space="0" w:sz="8" w:val="single"/>
+              <w:left w:color="000000" w:space="0" w:sz="8" w:val="single"/>
+              <w:bottom w:color="000000" w:space="0" w:sz="8" w:val="single"/>
+              <w:right w:color="000000" w:space="0" w:sz="8" w:val="single"/>
+            </w:tcBorders>
+            <w:shd w:fill="ffffff" w:val="clear"/>
+            <w:tcMar>
+              <w:top w:w="80.0" w:type="dxa"/>
+              <w:left w:w="100.0" w:type="dxa"/>
+              <w:bottom w:w="80.0" w:type="dxa"/>
+              <w:right w:w="100.0" w:type="dxa"/>
+            </w:tcMar>
+            <w:vAlign w:val="top"/>
+          </w:tcPr>
+          <w:p>
+            <w:pPr>
+              <w:spacing w:after="200" w:before="220" w:lineRule="auto"/>
+              <w:rPr>
+                <w:color w:val="434343"/>
+                <w:sz w:val="24"/>
+                <w:szCs w:val="24"/>
+              </w:rPr>
+            </w:pPr>
+            <w:r>
+              <w:rPr>
+                <w:color w:val="434343"/>
+                <w:sz w:val="24"/>
+                <w:szCs w:val="24"/>
                 <w:rtl w:val="0"/>
               </w:rPr>
               <w:t xml:space="preserve">Vista informativa con fechas clave del semestre (parciales, receso, inscripciones).</w:t>
@@ -1405,30 +1558,34 @@
         <w:tc>
           <w:tcPr>
             <w:tcBorders>
-              <w:top w:color="000000" w:space="0" w:sz="0" w:val="nil"/>
-              <w:left w:color="000000" w:space="0" w:sz="0" w:val="nil"/>
-              <w:bottom w:color="000000" w:space="0" w:sz="0" w:val="nil"/>
-              <w:right w:color="000000" w:space="0" w:sz="0" w:val="nil"/>
-            </w:tcBorders>
-            <w:shd w:fill="ffffff" w:val="clear"/>
-            <w:tcMar>
-              <w:top w:w="80.0" w:type="dxa"/>
-              <w:left w:w="100.0" w:type="dxa"/>
-              <w:bottom w:w="80.0" w:type="dxa"/>
-              <w:right w:w="100.0" w:type="dxa"/>
-            </w:tcMar>
-            <w:vAlign w:val="top"/>
-          </w:tcPr>
-          <w:p>
-            <w:pPr>
-              <w:spacing w:after="200" w:before="220" w:lineRule="auto"/>
-              <w:rPr>
-                <w:color w:val="2d3748"/>
-              </w:rPr>
-            </w:pPr>
-            <w:r>
-              <w:rPr>
-                <w:color w:val="2d3748"/>
+              <w:top w:color="000000" w:space="0" w:sz="8" w:val="single"/>
+              <w:left w:color="000000" w:space="0" w:sz="8" w:val="single"/>
+              <w:bottom w:color="000000" w:space="0" w:sz="8" w:val="single"/>
+              <w:right w:color="000000" w:space="0" w:sz="8" w:val="single"/>
+            </w:tcBorders>
+            <w:shd w:fill="ffffff" w:val="clear"/>
+            <w:tcMar>
+              <w:top w:w="80.0" w:type="dxa"/>
+              <w:left w:w="100.0" w:type="dxa"/>
+              <w:bottom w:w="80.0" w:type="dxa"/>
+              <w:right w:w="100.0" w:type="dxa"/>
+            </w:tcMar>
+            <w:vAlign w:val="top"/>
+          </w:tcPr>
+          <w:p>
+            <w:pPr>
+              <w:spacing w:after="200" w:before="220" w:lineRule="auto"/>
+              <w:rPr>
+                <w:color w:val="434343"/>
+                <w:sz w:val="24"/>
+                <w:szCs w:val="24"/>
+              </w:rPr>
+            </w:pPr>
+            <w:r>
+              <w:rPr>
+                <w:color w:val="434343"/>
+                <w:sz w:val="24"/>
+                <w:szCs w:val="24"/>
                 <w:rtl w:val="0"/>
               </w:rPr>
               <w:t xml:space="preserve">Baja</w:t>
@@ -1441,12 +1598,16 @@
       <w:pPr>
         <w:spacing w:after="160" w:before="220" w:lineRule="auto"/>
         <w:rPr>
-          <w:color w:val="2d3748"/>
+          <w:color w:val="434343"/>
+          <w:sz w:val="24"/>
+          <w:szCs w:val="24"/>
         </w:rPr>
       </w:pPr>
       <w:r>
         <w:rPr>
-          <w:color w:val="2d3748"/>
+          <w:color w:val="434343"/>
+          <w:sz w:val="24"/>
+          <w:szCs w:val="24"/>
           <w:rtl w:val="0"/>
         </w:rPr>
         <w:t xml:space="preserve"> </w:t>
@@ -1458,18 +1619,18 @@
         <w:rPr>
           <w:b w:val="1"/>
           <w:bCs w:val="1"/>
-          <w:color w:val="2b6cb0"/>
-          <w:sz w:val="28"/>
-          <w:szCs w:val="28"/>
+          <w:color w:val="434343"/>
+          <w:sz w:val="24"/>
+          <w:szCs w:val="24"/>
         </w:rPr>
       </w:pPr>
       <w:r>
         <w:rPr>
           <w:b w:val="1"/>
           <w:bCs w:val="1"/>
-          <w:color w:val="2b6cb0"/>
-          <w:sz w:val="28"/>
-          <w:szCs w:val="28"/>
+          <w:color w:val="434343"/>
+          <w:sz w:val="24"/>
+          <w:szCs w:val="24"/>
           <w:rtl w:val="0"/>
         </w:rPr>
         <w:t xml:space="preserve">2.2 Requerimientos No Funcionales (RNF)</w:t>
@@ -1479,12 +1640,16 @@
       <w:pPr>
         <w:spacing w:after="200" w:before="220" w:lineRule="auto"/>
         <w:rPr>
-          <w:color w:val="2d3748"/>
+          <w:color w:val="434343"/>
+          <w:sz w:val="24"/>
+          <w:szCs w:val="24"/>
         </w:rPr>
       </w:pPr>
       <w:r>
         <w:rPr>
-          <w:color w:val="2d3748"/>
+          <w:color w:val="434343"/>
+          <w:sz w:val="24"/>
+          <w:szCs w:val="24"/>
           <w:rtl w:val="0"/>
         </w:rPr>
         <w:t xml:space="preserve">Atributos de calidad, rendimiento y arquitectura de la solución:</w:t>
@@ -1529,12 +1694,12 @@
         <w:tc>
           <w:tcPr>
             <w:tcBorders>
-              <w:top w:color="000000" w:space="0" w:sz="0" w:val="nil"/>
-              <w:left w:color="000000" w:space="0" w:sz="0" w:val="nil"/>
-              <w:bottom w:color="000000" w:space="0" w:sz="0" w:val="nil"/>
-              <w:right w:color="000000" w:space="0" w:sz="0" w:val="nil"/>
-            </w:tcBorders>
-            <w:shd w:fill="1b365d" w:val="clear"/>
+              <w:top w:color="000000" w:space="0" w:sz="8" w:val="single"/>
+              <w:left w:color="000000" w:space="0" w:sz="8" w:val="single"/>
+              <w:bottom w:color="000000" w:space="0" w:sz="8" w:val="single"/>
+              <w:right w:color="000000" w:space="0" w:sz="8" w:val="single"/>
+            </w:tcBorders>
+            <w:shd w:fill="fce5cd" w:val="clear"/>
             <w:tcMar>
               <w:top w:w="100.0" w:type="dxa"/>
               <w:left w:w="100.0" w:type="dxa"/>
@@ -1549,14 +1714,18 @@
               <w:rPr>
                 <w:b w:val="1"/>
                 <w:bCs w:val="1"/>
-                <w:color w:val="ffffff"/>
-              </w:rPr>
-            </w:pPr>
-            <w:r>
-              <w:rPr>
-                <w:b w:val="1"/>
-                <w:bCs w:val="1"/>
-                <w:color w:val="ffffff"/>
+                <w:color w:val="434343"/>
+                <w:sz w:val="24"/>
+                <w:szCs w:val="24"/>
+              </w:rPr>
+            </w:pPr>
+            <w:r>
+              <w:rPr>
+                <w:b w:val="1"/>
+                <w:bCs w:val="1"/>
+                <w:color w:val="434343"/>
+                <w:sz w:val="24"/>
+                <w:szCs w:val="24"/>
                 <w:rtl w:val="0"/>
               </w:rPr>
               <w:t xml:space="preserve">Código</w:t>
@@ -1566,12 +1735,12 @@
         <w:tc>
           <w:tcPr>
             <w:tcBorders>
-              <w:top w:color="000000" w:space="0" w:sz="0" w:val="nil"/>
-              <w:left w:color="000000" w:space="0" w:sz="0" w:val="nil"/>
-              <w:bottom w:color="000000" w:space="0" w:sz="0" w:val="nil"/>
-              <w:right w:color="000000" w:space="0" w:sz="0" w:val="nil"/>
-            </w:tcBorders>
-            <w:shd w:fill="1b365d" w:val="clear"/>
+              <w:top w:color="000000" w:space="0" w:sz="8" w:val="single"/>
+              <w:left w:color="000000" w:space="0" w:sz="8" w:val="single"/>
+              <w:bottom w:color="000000" w:space="0" w:sz="8" w:val="single"/>
+              <w:right w:color="000000" w:space="0" w:sz="8" w:val="single"/>
+            </w:tcBorders>
+            <w:shd w:fill="fce5cd" w:val="clear"/>
             <w:tcMar>
               <w:top w:w="100.0" w:type="dxa"/>
               <w:left w:w="100.0" w:type="dxa"/>
@@ -1586,14 +1755,18 @@
               <w:rPr>
                 <w:b w:val="1"/>
                 <w:bCs w:val="1"/>
-                <w:color w:val="ffffff"/>
-              </w:rPr>
-            </w:pPr>
-            <w:r>
-              <w:rPr>
-                <w:b w:val="1"/>
-                <w:bCs w:val="1"/>
-                <w:color w:val="ffffff"/>
+                <w:color w:val="434343"/>
+                <w:sz w:val="24"/>
+                <w:szCs w:val="24"/>
+              </w:rPr>
+            </w:pPr>
+            <w:r>
+              <w:rPr>
+                <w:b w:val="1"/>
+                <w:bCs w:val="1"/>
+                <w:color w:val="434343"/>
+                <w:sz w:val="24"/>
+                <w:szCs w:val="24"/>
                 <w:rtl w:val="0"/>
               </w:rPr>
               <w:t xml:space="preserve">Categoría</w:t>
@@ -1603,12 +1776,12 @@
         <w:tc>
           <w:tcPr>
             <w:tcBorders>
-              <w:top w:color="000000" w:space="0" w:sz="0" w:val="nil"/>
-              <w:left w:color="000000" w:space="0" w:sz="0" w:val="nil"/>
-              <w:bottom w:color="000000" w:space="0" w:sz="0" w:val="nil"/>
-              <w:right w:color="000000" w:space="0" w:sz="0" w:val="nil"/>
-            </w:tcBorders>
-            <w:shd w:fill="1b365d" w:val="clear"/>
+              <w:top w:color="000000" w:space="0" w:sz="8" w:val="single"/>
+              <w:left w:color="000000" w:space="0" w:sz="8" w:val="single"/>
+              <w:bottom w:color="000000" w:space="0" w:sz="8" w:val="single"/>
+              <w:right w:color="000000" w:space="0" w:sz="8" w:val="single"/>
+            </w:tcBorders>
+            <w:shd w:fill="fce5cd" w:val="clear"/>
             <w:tcMar>
               <w:top w:w="100.0" w:type="dxa"/>
               <w:left w:w="100.0" w:type="dxa"/>
@@ -1623,14 +1796,18 @@
               <w:rPr>
                 <w:b w:val="1"/>
                 <w:bCs w:val="1"/>
-                <w:color w:val="ffffff"/>
-              </w:rPr>
-            </w:pPr>
-            <w:r>
-              <w:rPr>
-                <w:b w:val="1"/>
-                <w:bCs w:val="1"/>
-                <w:color w:val="ffffff"/>
+                <w:color w:val="434343"/>
+                <w:sz w:val="24"/>
+                <w:szCs w:val="24"/>
+              </w:rPr>
+            </w:pPr>
+            <w:r>
+              <w:rPr>
+                <w:b w:val="1"/>
+                <w:bCs w:val="1"/>
+                <w:color w:val="434343"/>
+                <w:sz w:val="24"/>
+                <w:szCs w:val="24"/>
                 <w:rtl w:val="0"/>
               </w:rPr>
               <w:t xml:space="preserve">Descripción y Criterio</w:t>
@@ -1640,12 +1817,12 @@
         <w:tc>
           <w:tcPr>
             <w:tcBorders>
-              <w:top w:color="000000" w:space="0" w:sz="0" w:val="nil"/>
-              <w:left w:color="000000" w:space="0" w:sz="0" w:val="nil"/>
-              <w:bottom w:color="000000" w:space="0" w:sz="0" w:val="nil"/>
-              <w:right w:color="000000" w:space="0" w:sz="0" w:val="nil"/>
-            </w:tcBorders>
-            <w:shd w:fill="1b365d" w:val="clear"/>
+              <w:top w:color="000000" w:space="0" w:sz="8" w:val="single"/>
+              <w:left w:color="000000" w:space="0" w:sz="8" w:val="single"/>
+              <w:bottom w:color="000000" w:space="0" w:sz="8" w:val="single"/>
+              <w:right w:color="000000" w:space="0" w:sz="8" w:val="single"/>
+            </w:tcBorders>
+            <w:shd w:fill="fce5cd" w:val="clear"/>
             <w:tcMar>
               <w:top w:w="100.0" w:type="dxa"/>
               <w:left w:w="100.0" w:type="dxa"/>
@@ -1660,14 +1837,18 @@
               <w:rPr>
                 <w:b w:val="1"/>
                 <w:bCs w:val="1"/>
-                <w:color w:val="ffffff"/>
-              </w:rPr>
-            </w:pPr>
-            <w:r>
-              <w:rPr>
-                <w:b w:val="1"/>
-                <w:bCs w:val="1"/>
-                <w:color w:val="ffffff"/>
+                <w:color w:val="434343"/>
+                <w:sz w:val="24"/>
+                <w:szCs w:val="24"/>
+              </w:rPr>
+            </w:pPr>
+            <w:r>
+              <w:rPr>
+                <w:b w:val="1"/>
+                <w:bCs w:val="1"/>
+                <w:color w:val="434343"/>
+                <w:sz w:val="24"/>
+                <w:szCs w:val="24"/>
                 <w:rtl w:val="0"/>
               </w:rPr>
               <w:t xml:space="preserve">Target</w:t>
@@ -1684,34 +1865,38 @@
         <w:tc>
           <w:tcPr>
             <w:tcBorders>
-              <w:top w:color="000000" w:space="0" w:sz="0" w:val="nil"/>
-              <w:left w:color="000000" w:space="0" w:sz="0" w:val="nil"/>
-              <w:bottom w:color="000000" w:space="0" w:sz="0" w:val="nil"/>
-              <w:right w:color="000000" w:space="0" w:sz="0" w:val="nil"/>
-            </w:tcBorders>
-            <w:shd w:fill="ffffff" w:val="clear"/>
-            <w:tcMar>
-              <w:top w:w="80.0" w:type="dxa"/>
-              <w:left w:w="100.0" w:type="dxa"/>
-              <w:bottom w:w="80.0" w:type="dxa"/>
-              <w:right w:w="100.0" w:type="dxa"/>
-            </w:tcMar>
-            <w:vAlign w:val="top"/>
-          </w:tcPr>
-          <w:p>
-            <w:pPr>
-              <w:spacing w:after="200" w:before="220" w:lineRule="auto"/>
-              <w:rPr>
-                <w:b w:val="1"/>
-                <w:bCs w:val="1"/>
-                <w:color w:val="2d3748"/>
-              </w:rPr>
-            </w:pPr>
-            <w:r>
-              <w:rPr>
-                <w:b w:val="1"/>
-                <w:bCs w:val="1"/>
-                <w:color w:val="2d3748"/>
+              <w:top w:color="000000" w:space="0" w:sz="8" w:val="single"/>
+              <w:left w:color="000000" w:space="0" w:sz="8" w:val="single"/>
+              <w:bottom w:color="000000" w:space="0" w:sz="8" w:val="single"/>
+              <w:right w:color="000000" w:space="0" w:sz="8" w:val="single"/>
+            </w:tcBorders>
+            <w:shd w:fill="ffffff" w:val="clear"/>
+            <w:tcMar>
+              <w:top w:w="80.0" w:type="dxa"/>
+              <w:left w:w="100.0" w:type="dxa"/>
+              <w:bottom w:w="80.0" w:type="dxa"/>
+              <w:right w:w="100.0" w:type="dxa"/>
+            </w:tcMar>
+            <w:vAlign w:val="top"/>
+          </w:tcPr>
+          <w:p>
+            <w:pPr>
+              <w:spacing w:after="200" w:before="220" w:lineRule="auto"/>
+              <w:rPr>
+                <w:b w:val="1"/>
+                <w:bCs w:val="1"/>
+                <w:color w:val="434343"/>
+                <w:sz w:val="24"/>
+                <w:szCs w:val="24"/>
+              </w:rPr>
+            </w:pPr>
+            <w:r>
+              <w:rPr>
+                <w:b w:val="1"/>
+                <w:bCs w:val="1"/>
+                <w:color w:val="434343"/>
+                <w:sz w:val="24"/>
+                <w:szCs w:val="24"/>
                 <w:rtl w:val="0"/>
               </w:rPr>
               <w:t xml:space="preserve">RNF-01</w:t>
@@ -1721,30 +1906,34 @@
         <w:tc>
           <w:tcPr>
             <w:tcBorders>
-              <w:top w:color="000000" w:space="0" w:sz="0" w:val="nil"/>
-              <w:left w:color="000000" w:space="0" w:sz="0" w:val="nil"/>
-              <w:bottom w:color="000000" w:space="0" w:sz="0" w:val="nil"/>
-              <w:right w:color="000000" w:space="0" w:sz="0" w:val="nil"/>
-            </w:tcBorders>
-            <w:shd w:fill="ffffff" w:val="clear"/>
-            <w:tcMar>
-              <w:top w:w="80.0" w:type="dxa"/>
-              <w:left w:w="100.0" w:type="dxa"/>
-              <w:bottom w:w="80.0" w:type="dxa"/>
-              <w:right w:w="100.0" w:type="dxa"/>
-            </w:tcMar>
-            <w:vAlign w:val="top"/>
-          </w:tcPr>
-          <w:p>
-            <w:pPr>
-              <w:spacing w:after="200" w:before="220" w:lineRule="auto"/>
-              <w:rPr>
-                <w:color w:val="2d3748"/>
-              </w:rPr>
-            </w:pPr>
-            <w:r>
-              <w:rPr>
-                <w:color w:val="2d3748"/>
+              <w:top w:color="000000" w:space="0" w:sz="8" w:val="single"/>
+              <w:left w:color="000000" w:space="0" w:sz="8" w:val="single"/>
+              <w:bottom w:color="000000" w:space="0" w:sz="8" w:val="single"/>
+              <w:right w:color="000000" w:space="0" w:sz="8" w:val="single"/>
+            </w:tcBorders>
+            <w:shd w:fill="ffffff" w:val="clear"/>
+            <w:tcMar>
+              <w:top w:w="80.0" w:type="dxa"/>
+              <w:left w:w="100.0" w:type="dxa"/>
+              <w:bottom w:w="80.0" w:type="dxa"/>
+              <w:right w:w="100.0" w:type="dxa"/>
+            </w:tcMar>
+            <w:vAlign w:val="top"/>
+          </w:tcPr>
+          <w:p>
+            <w:pPr>
+              <w:spacing w:after="200" w:before="220" w:lineRule="auto"/>
+              <w:rPr>
+                <w:color w:val="434343"/>
+                <w:sz w:val="24"/>
+                <w:szCs w:val="24"/>
+              </w:rPr>
+            </w:pPr>
+            <w:r>
+              <w:rPr>
+                <w:color w:val="434343"/>
+                <w:sz w:val="24"/>
+                <w:szCs w:val="24"/>
                 <w:rtl w:val="0"/>
               </w:rPr>
               <w:t xml:space="preserve">Usabilidad / Acceso</w:t>
@@ -1754,30 +1943,34 @@
         <w:tc>
           <w:tcPr>
             <w:tcBorders>
-              <w:top w:color="000000" w:space="0" w:sz="0" w:val="nil"/>
-              <w:left w:color="000000" w:space="0" w:sz="0" w:val="nil"/>
-              <w:bottom w:color="000000" w:space="0" w:sz="0" w:val="nil"/>
-              <w:right w:color="000000" w:space="0" w:sz="0" w:val="nil"/>
-            </w:tcBorders>
-            <w:shd w:fill="ffffff" w:val="clear"/>
-            <w:tcMar>
-              <w:top w:w="80.0" w:type="dxa"/>
-              <w:left w:w="100.0" w:type="dxa"/>
-              <w:bottom w:w="80.0" w:type="dxa"/>
-              <w:right w:w="100.0" w:type="dxa"/>
-            </w:tcMar>
-            <w:vAlign w:val="top"/>
-          </w:tcPr>
-          <w:p>
-            <w:pPr>
-              <w:spacing w:after="200" w:before="220" w:lineRule="auto"/>
-              <w:rPr>
-                <w:color w:val="2d3748"/>
-              </w:rPr>
-            </w:pPr>
-            <w:r>
-              <w:rPr>
-                <w:color w:val="2d3748"/>
+              <w:top w:color="000000" w:space="0" w:sz="8" w:val="single"/>
+              <w:left w:color="000000" w:space="0" w:sz="8" w:val="single"/>
+              <w:bottom w:color="000000" w:space="0" w:sz="8" w:val="single"/>
+              <w:right w:color="000000" w:space="0" w:sz="8" w:val="single"/>
+            </w:tcBorders>
+            <w:shd w:fill="ffffff" w:val="clear"/>
+            <w:tcMar>
+              <w:top w:w="80.0" w:type="dxa"/>
+              <w:left w:w="100.0" w:type="dxa"/>
+              <w:bottom w:w="80.0" w:type="dxa"/>
+              <w:right w:w="100.0" w:type="dxa"/>
+            </w:tcMar>
+            <w:vAlign w:val="top"/>
+          </w:tcPr>
+          <w:p>
+            <w:pPr>
+              <w:spacing w:after="200" w:before="220" w:lineRule="auto"/>
+              <w:rPr>
+                <w:color w:val="434343"/>
+                <w:sz w:val="24"/>
+                <w:szCs w:val="24"/>
+              </w:rPr>
+            </w:pPr>
+            <w:r>
+              <w:rPr>
+                <w:color w:val="434343"/>
+                <w:sz w:val="24"/>
+                <w:szCs w:val="24"/>
                 <w:rtl w:val="0"/>
               </w:rPr>
               <w:t xml:space="preserve">Acceso 100% público a la información sin pantallas de login.</w:t>
@@ -1787,30 +1980,34 @@
         <w:tc>
           <w:tcPr>
             <w:tcBorders>
-              <w:top w:color="000000" w:space="0" w:sz="0" w:val="nil"/>
-              <w:left w:color="000000" w:space="0" w:sz="0" w:val="nil"/>
-              <w:bottom w:color="000000" w:space="0" w:sz="0" w:val="nil"/>
-              <w:right w:color="000000" w:space="0" w:sz="0" w:val="nil"/>
-            </w:tcBorders>
-            <w:shd w:fill="ffffff" w:val="clear"/>
-            <w:tcMar>
-              <w:top w:w="80.0" w:type="dxa"/>
-              <w:left w:w="100.0" w:type="dxa"/>
-              <w:bottom w:w="80.0" w:type="dxa"/>
-              <w:right w:w="100.0" w:type="dxa"/>
-            </w:tcMar>
-            <w:vAlign w:val="top"/>
-          </w:tcPr>
-          <w:p>
-            <w:pPr>
-              <w:spacing w:after="200" w:before="220" w:lineRule="auto"/>
-              <w:rPr>
-                <w:color w:val="2d3748"/>
-              </w:rPr>
-            </w:pPr>
-            <w:r>
-              <w:rPr>
-                <w:color w:val="2d3748"/>
+              <w:top w:color="000000" w:space="0" w:sz="8" w:val="single"/>
+              <w:left w:color="000000" w:space="0" w:sz="8" w:val="single"/>
+              <w:bottom w:color="000000" w:space="0" w:sz="8" w:val="single"/>
+              <w:right w:color="000000" w:space="0" w:sz="8" w:val="single"/>
+            </w:tcBorders>
+            <w:shd w:fill="ffffff" w:val="clear"/>
+            <w:tcMar>
+              <w:top w:w="80.0" w:type="dxa"/>
+              <w:left w:w="100.0" w:type="dxa"/>
+              <w:bottom w:w="80.0" w:type="dxa"/>
+              <w:right w:w="100.0" w:type="dxa"/>
+            </w:tcMar>
+            <w:vAlign w:val="top"/>
+          </w:tcPr>
+          <w:p>
+            <w:pPr>
+              <w:spacing w:after="200" w:before="220" w:lineRule="auto"/>
+              <w:rPr>
+                <w:color w:val="434343"/>
+                <w:sz w:val="24"/>
+                <w:szCs w:val="24"/>
+              </w:rPr>
+            </w:pPr>
+            <w:r>
+              <w:rPr>
+                <w:color w:val="434343"/>
+                <w:sz w:val="24"/>
+                <w:szCs w:val="24"/>
                 <w:rtl w:val="0"/>
               </w:rPr>
               <w:t xml:space="preserve">0 barreras de acceso</w:t>
@@ -1827,34 +2024,38 @@
         <w:tc>
           <w:tcPr>
             <w:tcBorders>
-              <w:top w:color="000000" w:space="0" w:sz="0" w:val="nil"/>
-              <w:left w:color="000000" w:space="0" w:sz="0" w:val="nil"/>
-              <w:bottom w:color="000000" w:space="0" w:sz="0" w:val="nil"/>
-              <w:right w:color="000000" w:space="0" w:sz="0" w:val="nil"/>
-            </w:tcBorders>
-            <w:shd w:fill="f4f6f9" w:val="clear"/>
-            <w:tcMar>
-              <w:top w:w="80.0" w:type="dxa"/>
-              <w:left w:w="100.0" w:type="dxa"/>
-              <w:bottom w:w="80.0" w:type="dxa"/>
-              <w:right w:w="100.0" w:type="dxa"/>
-            </w:tcMar>
-            <w:vAlign w:val="top"/>
-          </w:tcPr>
-          <w:p>
-            <w:pPr>
-              <w:spacing w:after="200" w:before="220" w:lineRule="auto"/>
-              <w:rPr>
-                <w:b w:val="1"/>
-                <w:bCs w:val="1"/>
-                <w:color w:val="2d3748"/>
-              </w:rPr>
-            </w:pPr>
-            <w:r>
-              <w:rPr>
-                <w:b w:val="1"/>
-                <w:bCs w:val="1"/>
-                <w:color w:val="2d3748"/>
+              <w:top w:color="000000" w:space="0" w:sz="8" w:val="single"/>
+              <w:left w:color="000000" w:space="0" w:sz="8" w:val="single"/>
+              <w:bottom w:color="000000" w:space="0" w:sz="8" w:val="single"/>
+              <w:right w:color="000000" w:space="0" w:sz="8" w:val="single"/>
+            </w:tcBorders>
+            <w:shd w:fill="ffffff" w:val="clear"/>
+            <w:tcMar>
+              <w:top w:w="80.0" w:type="dxa"/>
+              <w:left w:w="100.0" w:type="dxa"/>
+              <w:bottom w:w="80.0" w:type="dxa"/>
+              <w:right w:w="100.0" w:type="dxa"/>
+            </w:tcMar>
+            <w:vAlign w:val="top"/>
+          </w:tcPr>
+          <w:p>
+            <w:pPr>
+              <w:spacing w:after="200" w:before="220" w:lineRule="auto"/>
+              <w:rPr>
+                <w:b w:val="1"/>
+                <w:bCs w:val="1"/>
+                <w:color w:val="434343"/>
+                <w:sz w:val="24"/>
+                <w:szCs w:val="24"/>
+              </w:rPr>
+            </w:pPr>
+            <w:r>
+              <w:rPr>
+                <w:b w:val="1"/>
+                <w:bCs w:val="1"/>
+                <w:color w:val="434343"/>
+                <w:sz w:val="24"/>
+                <w:szCs w:val="24"/>
                 <w:rtl w:val="0"/>
               </w:rPr>
               <w:t xml:space="preserve">RNF-02</w:t>
@@ -1864,30 +2065,34 @@
         <w:tc>
           <w:tcPr>
             <w:tcBorders>
-              <w:top w:color="000000" w:space="0" w:sz="0" w:val="nil"/>
-              <w:left w:color="000000" w:space="0" w:sz="0" w:val="nil"/>
-              <w:bottom w:color="000000" w:space="0" w:sz="0" w:val="nil"/>
-              <w:right w:color="000000" w:space="0" w:sz="0" w:val="nil"/>
-            </w:tcBorders>
-            <w:shd w:fill="f4f6f9" w:val="clear"/>
-            <w:tcMar>
-              <w:top w:w="80.0" w:type="dxa"/>
-              <w:left w:w="100.0" w:type="dxa"/>
-              <w:bottom w:w="80.0" w:type="dxa"/>
-              <w:right w:w="100.0" w:type="dxa"/>
-            </w:tcMar>
-            <w:vAlign w:val="top"/>
-          </w:tcPr>
-          <w:p>
-            <w:pPr>
-              <w:spacing w:after="200" w:before="220" w:lineRule="auto"/>
-              <w:rPr>
-                <w:color w:val="2d3748"/>
-              </w:rPr>
-            </w:pPr>
-            <w:r>
-              <w:rPr>
-                <w:color w:val="2d3748"/>
+              <w:top w:color="000000" w:space="0" w:sz="8" w:val="single"/>
+              <w:left w:color="000000" w:space="0" w:sz="8" w:val="single"/>
+              <w:bottom w:color="000000" w:space="0" w:sz="8" w:val="single"/>
+              <w:right w:color="000000" w:space="0" w:sz="8" w:val="single"/>
+            </w:tcBorders>
+            <w:shd w:fill="ffffff" w:val="clear"/>
+            <w:tcMar>
+              <w:top w:w="80.0" w:type="dxa"/>
+              <w:left w:w="100.0" w:type="dxa"/>
+              <w:bottom w:w="80.0" w:type="dxa"/>
+              <w:right w:w="100.0" w:type="dxa"/>
+            </w:tcMar>
+            <w:vAlign w:val="top"/>
+          </w:tcPr>
+          <w:p>
+            <w:pPr>
+              <w:spacing w:after="200" w:before="220" w:lineRule="auto"/>
+              <w:rPr>
+                <w:color w:val="434343"/>
+                <w:sz w:val="24"/>
+                <w:szCs w:val="24"/>
+              </w:rPr>
+            </w:pPr>
+            <w:r>
+              <w:rPr>
+                <w:color w:val="434343"/>
+                <w:sz w:val="24"/>
+                <w:szCs w:val="24"/>
                 <w:rtl w:val="0"/>
               </w:rPr>
               <w:t xml:space="preserve">Rendimiento API</w:t>
@@ -1897,30 +2102,34 @@
         <w:tc>
           <w:tcPr>
             <w:tcBorders>
-              <w:top w:color="000000" w:space="0" w:sz="0" w:val="nil"/>
-              <w:left w:color="000000" w:space="0" w:sz="0" w:val="nil"/>
-              <w:bottom w:color="000000" w:space="0" w:sz="0" w:val="nil"/>
-              <w:right w:color="000000" w:space="0" w:sz="0" w:val="nil"/>
-            </w:tcBorders>
-            <w:shd w:fill="f4f6f9" w:val="clear"/>
-            <w:tcMar>
-              <w:top w:w="80.0" w:type="dxa"/>
-              <w:left w:w="100.0" w:type="dxa"/>
-              <w:bottom w:w="80.0" w:type="dxa"/>
-              <w:right w:w="100.0" w:type="dxa"/>
-            </w:tcMar>
-            <w:vAlign w:val="top"/>
-          </w:tcPr>
-          <w:p>
-            <w:pPr>
-              <w:spacing w:after="200" w:before="220" w:lineRule="auto"/>
-              <w:rPr>
-                <w:color w:val="2d3748"/>
-              </w:rPr>
-            </w:pPr>
-            <w:r>
-              <w:rPr>
-                <w:color w:val="2d3748"/>
+              <w:top w:color="000000" w:space="0" w:sz="8" w:val="single"/>
+              <w:left w:color="000000" w:space="0" w:sz="8" w:val="single"/>
+              <w:bottom w:color="000000" w:space="0" w:sz="8" w:val="single"/>
+              <w:right w:color="000000" w:space="0" w:sz="8" w:val="single"/>
+            </w:tcBorders>
+            <w:shd w:fill="ffffff" w:val="clear"/>
+            <w:tcMar>
+              <w:top w:w="80.0" w:type="dxa"/>
+              <w:left w:w="100.0" w:type="dxa"/>
+              <w:bottom w:w="80.0" w:type="dxa"/>
+              <w:right w:w="100.0" w:type="dxa"/>
+            </w:tcMar>
+            <w:vAlign w:val="top"/>
+          </w:tcPr>
+          <w:p>
+            <w:pPr>
+              <w:spacing w:after="200" w:before="220" w:lineRule="auto"/>
+              <w:rPr>
+                <w:color w:val="434343"/>
+                <w:sz w:val="24"/>
+                <w:szCs w:val="24"/>
+              </w:rPr>
+            </w:pPr>
+            <w:r>
+              <w:rPr>
+                <w:color w:val="434343"/>
+                <w:sz w:val="24"/>
+                <w:szCs w:val="24"/>
                 <w:rtl w:val="0"/>
               </w:rPr>
               <w:t xml:space="preserve">Respuesta eficiente de endpoints HTTP GET en Node.js Express.</w:t>
@@ -1930,30 +2139,34 @@
         <w:tc>
           <w:tcPr>
             <w:tcBorders>
-              <w:top w:color="000000" w:space="0" w:sz="0" w:val="nil"/>
-              <w:left w:color="000000" w:space="0" w:sz="0" w:val="nil"/>
-              <w:bottom w:color="000000" w:space="0" w:sz="0" w:val="nil"/>
-              <w:right w:color="000000" w:space="0" w:sz="0" w:val="nil"/>
-            </w:tcBorders>
-            <w:shd w:fill="f4f6f9" w:val="clear"/>
-            <w:tcMar>
-              <w:top w:w="80.0" w:type="dxa"/>
-              <w:left w:w="100.0" w:type="dxa"/>
-              <w:bottom w:w="80.0" w:type="dxa"/>
-              <w:right w:w="100.0" w:type="dxa"/>
-            </w:tcMar>
-            <w:vAlign w:val="top"/>
-          </w:tcPr>
-          <w:p>
-            <w:pPr>
-              <w:spacing w:after="200" w:before="220" w:lineRule="auto"/>
-              <w:rPr>
-                <w:color w:val="2d3748"/>
-              </w:rPr>
-            </w:pPr>
-            <w:r>
-              <w:rPr>
-                <w:color w:val="2d3748"/>
+              <w:top w:color="000000" w:space="0" w:sz="8" w:val="single"/>
+              <w:left w:color="000000" w:space="0" w:sz="8" w:val="single"/>
+              <w:bottom w:color="000000" w:space="0" w:sz="8" w:val="single"/>
+              <w:right w:color="000000" w:space="0" w:sz="8" w:val="single"/>
+            </w:tcBorders>
+            <w:shd w:fill="ffffff" w:val="clear"/>
+            <w:tcMar>
+              <w:top w:w="80.0" w:type="dxa"/>
+              <w:left w:w="100.0" w:type="dxa"/>
+              <w:bottom w:w="80.0" w:type="dxa"/>
+              <w:right w:w="100.0" w:type="dxa"/>
+            </w:tcMar>
+            <w:vAlign w:val="top"/>
+          </w:tcPr>
+          <w:p>
+            <w:pPr>
+              <w:spacing w:after="200" w:before="220" w:lineRule="auto"/>
+              <w:rPr>
+                <w:color w:val="434343"/>
+                <w:sz w:val="24"/>
+                <w:szCs w:val="24"/>
+              </w:rPr>
+            </w:pPr>
+            <w:r>
+              <w:rPr>
+                <w:color w:val="434343"/>
+                <w:sz w:val="24"/>
+                <w:szCs w:val="24"/>
                 <w:rtl w:val="0"/>
               </w:rPr>
               <w:t xml:space="preserve">Tiempo &lt; 1.5s</w:t>
@@ -1970,34 +2183,38 @@
         <w:tc>
           <w:tcPr>
             <w:tcBorders>
-              <w:top w:color="000000" w:space="0" w:sz="0" w:val="nil"/>
-              <w:left w:color="000000" w:space="0" w:sz="0" w:val="nil"/>
-              <w:bottom w:color="000000" w:space="0" w:sz="0" w:val="nil"/>
-              <w:right w:color="000000" w:space="0" w:sz="0" w:val="nil"/>
-            </w:tcBorders>
-            <w:shd w:fill="ffffff" w:val="clear"/>
-            <w:tcMar>
-              <w:top w:w="80.0" w:type="dxa"/>
-              <w:left w:w="100.0" w:type="dxa"/>
-              <w:bottom w:w="80.0" w:type="dxa"/>
-              <w:right w:w="100.0" w:type="dxa"/>
-            </w:tcMar>
-            <w:vAlign w:val="top"/>
-          </w:tcPr>
-          <w:p>
-            <w:pPr>
-              <w:spacing w:after="200" w:before="220" w:lineRule="auto"/>
-              <w:rPr>
-                <w:b w:val="1"/>
-                <w:bCs w:val="1"/>
-                <w:color w:val="2d3748"/>
-              </w:rPr>
-            </w:pPr>
-            <w:r>
-              <w:rPr>
-                <w:b w:val="1"/>
-                <w:bCs w:val="1"/>
-                <w:color w:val="2d3748"/>
+              <w:top w:color="000000" w:space="0" w:sz="8" w:val="single"/>
+              <w:left w:color="000000" w:space="0" w:sz="8" w:val="single"/>
+              <w:bottom w:color="000000" w:space="0" w:sz="8" w:val="single"/>
+              <w:right w:color="000000" w:space="0" w:sz="8" w:val="single"/>
+            </w:tcBorders>
+            <w:shd w:fill="ffffff" w:val="clear"/>
+            <w:tcMar>
+              <w:top w:w="80.0" w:type="dxa"/>
+              <w:left w:w="100.0" w:type="dxa"/>
+              <w:bottom w:w="80.0" w:type="dxa"/>
+              <w:right w:w="100.0" w:type="dxa"/>
+            </w:tcMar>
+            <w:vAlign w:val="top"/>
+          </w:tcPr>
+          <w:p>
+            <w:pPr>
+              <w:spacing w:after="200" w:before="220" w:lineRule="auto"/>
+              <w:rPr>
+                <w:b w:val="1"/>
+                <w:bCs w:val="1"/>
+                <w:color w:val="434343"/>
+                <w:sz w:val="24"/>
+                <w:szCs w:val="24"/>
+              </w:rPr>
+            </w:pPr>
+            <w:r>
+              <w:rPr>
+                <w:b w:val="1"/>
+                <w:bCs w:val="1"/>
+                <w:color w:val="434343"/>
+                <w:sz w:val="24"/>
+                <w:szCs w:val="24"/>
                 <w:rtl w:val="0"/>
               </w:rPr>
               <w:t xml:space="preserve">RNF-03</w:t>
@@ -2007,30 +2224,34 @@
         <w:tc>
           <w:tcPr>
             <w:tcBorders>
-              <w:top w:color="000000" w:space="0" w:sz="0" w:val="nil"/>
-              <w:left w:color="000000" w:space="0" w:sz="0" w:val="nil"/>
-              <w:bottom w:color="000000" w:space="0" w:sz="0" w:val="nil"/>
-              <w:right w:color="000000" w:space="0" w:sz="0" w:val="nil"/>
-            </w:tcBorders>
-            <w:shd w:fill="ffffff" w:val="clear"/>
-            <w:tcMar>
-              <w:top w:w="80.0" w:type="dxa"/>
-              <w:left w:w="100.0" w:type="dxa"/>
-              <w:bottom w:w="80.0" w:type="dxa"/>
-              <w:right w:w="100.0" w:type="dxa"/>
-            </w:tcMar>
-            <w:vAlign w:val="top"/>
-          </w:tcPr>
-          <w:p>
-            <w:pPr>
-              <w:spacing w:after="200" w:before="220" w:lineRule="auto"/>
-              <w:rPr>
-                <w:color w:val="2d3748"/>
-              </w:rPr>
-            </w:pPr>
-            <w:r>
-              <w:rPr>
-                <w:color w:val="2d3748"/>
+              <w:top w:color="000000" w:space="0" w:sz="8" w:val="single"/>
+              <w:left w:color="000000" w:space="0" w:sz="8" w:val="single"/>
+              <w:bottom w:color="000000" w:space="0" w:sz="8" w:val="single"/>
+              <w:right w:color="000000" w:space="0" w:sz="8" w:val="single"/>
+            </w:tcBorders>
+            <w:shd w:fill="ffffff" w:val="clear"/>
+            <w:tcMar>
+              <w:top w:w="80.0" w:type="dxa"/>
+              <w:left w:w="100.0" w:type="dxa"/>
+              <w:bottom w:w="80.0" w:type="dxa"/>
+              <w:right w:w="100.0" w:type="dxa"/>
+            </w:tcMar>
+            <w:vAlign w:val="top"/>
+          </w:tcPr>
+          <w:p>
+            <w:pPr>
+              <w:spacing w:after="200" w:before="220" w:lineRule="auto"/>
+              <w:rPr>
+                <w:color w:val="434343"/>
+                <w:sz w:val="24"/>
+                <w:szCs w:val="24"/>
+              </w:rPr>
+            </w:pPr>
+            <w:r>
+              <w:rPr>
+                <w:color w:val="434343"/>
+                <w:sz w:val="24"/>
+                <w:szCs w:val="24"/>
                 <w:rtl w:val="0"/>
               </w:rPr>
               <w:t xml:space="preserve">Adaptabilidad UI</w:t>
@@ -2040,30 +2261,34 @@
         <w:tc>
           <w:tcPr>
             <w:tcBorders>
-              <w:top w:color="000000" w:space="0" w:sz="0" w:val="nil"/>
-              <w:left w:color="000000" w:space="0" w:sz="0" w:val="nil"/>
-              <w:bottom w:color="000000" w:space="0" w:sz="0" w:val="nil"/>
-              <w:right w:color="000000" w:space="0" w:sz="0" w:val="nil"/>
-            </w:tcBorders>
-            <w:shd w:fill="ffffff" w:val="clear"/>
-            <w:tcMar>
-              <w:top w:w="80.0" w:type="dxa"/>
-              <w:left w:w="100.0" w:type="dxa"/>
-              <w:bottom w:w="80.0" w:type="dxa"/>
-              <w:right w:w="100.0" w:type="dxa"/>
-            </w:tcMar>
-            <w:vAlign w:val="top"/>
-          </w:tcPr>
-          <w:p>
-            <w:pPr>
-              <w:spacing w:after="200" w:before="220" w:lineRule="auto"/>
-              <w:rPr>
-                <w:color w:val="2d3748"/>
-              </w:rPr>
-            </w:pPr>
-            <w:r>
-              <w:rPr>
-                <w:color w:val="2d3748"/>
+              <w:top w:color="000000" w:space="0" w:sz="8" w:val="single"/>
+              <w:left w:color="000000" w:space="0" w:sz="8" w:val="single"/>
+              <w:bottom w:color="000000" w:space="0" w:sz="8" w:val="single"/>
+              <w:right w:color="000000" w:space="0" w:sz="8" w:val="single"/>
+            </w:tcBorders>
+            <w:shd w:fill="ffffff" w:val="clear"/>
+            <w:tcMar>
+              <w:top w:w="80.0" w:type="dxa"/>
+              <w:left w:w="100.0" w:type="dxa"/>
+              <w:bottom w:w="80.0" w:type="dxa"/>
+              <w:right w:w="100.0" w:type="dxa"/>
+            </w:tcMar>
+            <w:vAlign w:val="top"/>
+          </w:tcPr>
+          <w:p>
+            <w:pPr>
+              <w:spacing w:after="200" w:before="220" w:lineRule="auto"/>
+              <w:rPr>
+                <w:color w:val="434343"/>
+                <w:sz w:val="24"/>
+                <w:szCs w:val="24"/>
+              </w:rPr>
+            </w:pPr>
+            <w:r>
+              <w:rPr>
+                <w:color w:val="434343"/>
+                <w:sz w:val="24"/>
+                <w:szCs w:val="24"/>
                 <w:rtl w:val="0"/>
               </w:rPr>
               <w:t xml:space="preserve">Interfaz fluida adaptada a pantallas móviles y de escritorio en Flutter.</w:t>
@@ -2073,30 +2298,34 @@
         <w:tc>
           <w:tcPr>
             <w:tcBorders>
-              <w:top w:color="000000" w:space="0" w:sz="0" w:val="nil"/>
-              <w:left w:color="000000" w:space="0" w:sz="0" w:val="nil"/>
-              <w:bottom w:color="000000" w:space="0" w:sz="0" w:val="nil"/>
-              <w:right w:color="000000" w:space="0" w:sz="0" w:val="nil"/>
-            </w:tcBorders>
-            <w:shd w:fill="ffffff" w:val="clear"/>
-            <w:tcMar>
-              <w:top w:w="80.0" w:type="dxa"/>
-              <w:left w:w="100.0" w:type="dxa"/>
-              <w:bottom w:w="80.0" w:type="dxa"/>
-              <w:right w:w="100.0" w:type="dxa"/>
-            </w:tcMar>
-            <w:vAlign w:val="top"/>
-          </w:tcPr>
-          <w:p>
-            <w:pPr>
-              <w:spacing w:after="200" w:before="220" w:lineRule="auto"/>
-              <w:rPr>
-                <w:color w:val="2d3748"/>
-              </w:rPr>
-            </w:pPr>
-            <w:r>
-              <w:rPr>
-                <w:color w:val="2d3748"/>
+              <w:top w:color="000000" w:space="0" w:sz="8" w:val="single"/>
+              <w:left w:color="000000" w:space="0" w:sz="8" w:val="single"/>
+              <w:bottom w:color="000000" w:space="0" w:sz="8" w:val="single"/>
+              <w:right w:color="000000" w:space="0" w:sz="8" w:val="single"/>
+            </w:tcBorders>
+            <w:shd w:fill="ffffff" w:val="clear"/>
+            <w:tcMar>
+              <w:top w:w="80.0" w:type="dxa"/>
+              <w:left w:w="100.0" w:type="dxa"/>
+              <w:bottom w:w="80.0" w:type="dxa"/>
+              <w:right w:w="100.0" w:type="dxa"/>
+            </w:tcMar>
+            <w:vAlign w:val="top"/>
+          </w:tcPr>
+          <w:p>
+            <w:pPr>
+              <w:spacing w:after="200" w:before="220" w:lineRule="auto"/>
+              <w:rPr>
+                <w:color w:val="434343"/>
+                <w:sz w:val="24"/>
+                <w:szCs w:val="24"/>
+              </w:rPr>
+            </w:pPr>
+            <w:r>
+              <w:rPr>
+                <w:color w:val="434343"/>
+                <w:sz w:val="24"/>
+                <w:szCs w:val="24"/>
                 <w:rtl w:val="0"/>
               </w:rPr>
               <w:t xml:space="preserve">360px a 1920px</w:t>
@@ -2113,34 +2342,38 @@
         <w:tc>
           <w:tcPr>
             <w:tcBorders>
-              <w:top w:color="000000" w:space="0" w:sz="0" w:val="nil"/>
-              <w:left w:color="000000" w:space="0" w:sz="0" w:val="nil"/>
-              <w:bottom w:color="000000" w:space="0" w:sz="0" w:val="nil"/>
-              <w:right w:color="000000" w:space="0" w:sz="0" w:val="nil"/>
-            </w:tcBorders>
-            <w:shd w:fill="f4f6f9" w:val="clear"/>
-            <w:tcMar>
-              <w:top w:w="80.0" w:type="dxa"/>
-              <w:left w:w="100.0" w:type="dxa"/>
-              <w:bottom w:w="80.0" w:type="dxa"/>
-              <w:right w:w="100.0" w:type="dxa"/>
-            </w:tcMar>
-            <w:vAlign w:val="top"/>
-          </w:tcPr>
-          <w:p>
-            <w:pPr>
-              <w:spacing w:after="200" w:before="220" w:lineRule="auto"/>
-              <w:rPr>
-                <w:b w:val="1"/>
-                <w:bCs w:val="1"/>
-                <w:color w:val="2d3748"/>
-              </w:rPr>
-            </w:pPr>
-            <w:r>
-              <w:rPr>
-                <w:b w:val="1"/>
-                <w:bCs w:val="1"/>
-                <w:color w:val="2d3748"/>
+              <w:top w:color="000000" w:space="0" w:sz="8" w:val="single"/>
+              <w:left w:color="000000" w:space="0" w:sz="8" w:val="single"/>
+              <w:bottom w:color="000000" w:space="0" w:sz="8" w:val="single"/>
+              <w:right w:color="000000" w:space="0" w:sz="8" w:val="single"/>
+            </w:tcBorders>
+            <w:shd w:fill="ffffff" w:val="clear"/>
+            <w:tcMar>
+              <w:top w:w="80.0" w:type="dxa"/>
+              <w:left w:w="100.0" w:type="dxa"/>
+              <w:bottom w:w="80.0" w:type="dxa"/>
+              <w:right w:w="100.0" w:type="dxa"/>
+            </w:tcMar>
+            <w:vAlign w:val="top"/>
+          </w:tcPr>
+          <w:p>
+            <w:pPr>
+              <w:spacing w:after="200" w:before="220" w:lineRule="auto"/>
+              <w:rPr>
+                <w:b w:val="1"/>
+                <w:bCs w:val="1"/>
+                <w:color w:val="434343"/>
+                <w:sz w:val="24"/>
+                <w:szCs w:val="24"/>
+              </w:rPr>
+            </w:pPr>
+            <w:r>
+              <w:rPr>
+                <w:b w:val="1"/>
+                <w:bCs w:val="1"/>
+                <w:color w:val="434343"/>
+                <w:sz w:val="24"/>
+                <w:szCs w:val="24"/>
                 <w:rtl w:val="0"/>
               </w:rPr>
               <w:t xml:space="preserve">RNF-04</w:t>
@@ -2150,30 +2383,34 @@
         <w:tc>
           <w:tcPr>
             <w:tcBorders>
-              <w:top w:color="000000" w:space="0" w:sz="0" w:val="nil"/>
-              <w:left w:color="000000" w:space="0" w:sz="0" w:val="nil"/>
-              <w:bottom w:color="000000" w:space="0" w:sz="0" w:val="nil"/>
-              <w:right w:color="000000" w:space="0" w:sz="0" w:val="nil"/>
-            </w:tcBorders>
-            <w:shd w:fill="f4f6f9" w:val="clear"/>
-            <w:tcMar>
-              <w:top w:w="80.0" w:type="dxa"/>
-              <w:left w:w="100.0" w:type="dxa"/>
-              <w:bottom w:w="80.0" w:type="dxa"/>
-              <w:right w:w="100.0" w:type="dxa"/>
-            </w:tcMar>
-            <w:vAlign w:val="top"/>
-          </w:tcPr>
-          <w:p>
-            <w:pPr>
-              <w:spacing w:after="200" w:before="220" w:lineRule="auto"/>
-              <w:rPr>
-                <w:color w:val="2d3748"/>
-              </w:rPr>
-            </w:pPr>
-            <w:r>
-              <w:rPr>
-                <w:color w:val="2d3748"/>
+              <w:top w:color="000000" w:space="0" w:sz="8" w:val="single"/>
+              <w:left w:color="000000" w:space="0" w:sz="8" w:val="single"/>
+              <w:bottom w:color="000000" w:space="0" w:sz="8" w:val="single"/>
+              <w:right w:color="000000" w:space="0" w:sz="8" w:val="single"/>
+            </w:tcBorders>
+            <w:shd w:fill="ffffff" w:val="clear"/>
+            <w:tcMar>
+              <w:top w:w="80.0" w:type="dxa"/>
+              <w:left w:w="100.0" w:type="dxa"/>
+              <w:bottom w:w="80.0" w:type="dxa"/>
+              <w:right w:w="100.0" w:type="dxa"/>
+            </w:tcMar>
+            <w:vAlign w:val="top"/>
+          </w:tcPr>
+          <w:p>
+            <w:pPr>
+              <w:spacing w:after="200" w:before="220" w:lineRule="auto"/>
+              <w:rPr>
+                <w:color w:val="434343"/>
+                <w:sz w:val="24"/>
+                <w:szCs w:val="24"/>
+              </w:rPr>
+            </w:pPr>
+            <w:r>
+              <w:rPr>
+                <w:color w:val="434343"/>
+                <w:sz w:val="24"/>
+                <w:szCs w:val="24"/>
                 <w:rtl w:val="0"/>
               </w:rPr>
               <w:t xml:space="preserve">Arquitectura REST</w:t>
@@ -2183,30 +2420,34 @@
         <w:tc>
           <w:tcPr>
             <w:tcBorders>
-              <w:top w:color="000000" w:space="0" w:sz="0" w:val="nil"/>
-              <w:left w:color="000000" w:space="0" w:sz="0" w:val="nil"/>
-              <w:bottom w:color="000000" w:space="0" w:sz="0" w:val="nil"/>
-              <w:right w:color="000000" w:space="0" w:sz="0" w:val="nil"/>
-            </w:tcBorders>
-            <w:shd w:fill="f4f6f9" w:val="clear"/>
-            <w:tcMar>
-              <w:top w:w="80.0" w:type="dxa"/>
-              <w:left w:w="100.0" w:type="dxa"/>
-              <w:bottom w:w="80.0" w:type="dxa"/>
-              <w:right w:w="100.0" w:type="dxa"/>
-            </w:tcMar>
-            <w:vAlign w:val="top"/>
-          </w:tcPr>
-          <w:p>
-            <w:pPr>
-              <w:spacing w:after="200" w:before="220" w:lineRule="auto"/>
-              <w:rPr>
-                <w:color w:val="2d3748"/>
-              </w:rPr>
-            </w:pPr>
-            <w:r>
-              <w:rPr>
-                <w:color w:val="2d3748"/>
+              <w:top w:color="000000" w:space="0" w:sz="8" w:val="single"/>
+              <w:left w:color="000000" w:space="0" w:sz="8" w:val="single"/>
+              <w:bottom w:color="000000" w:space="0" w:sz="8" w:val="single"/>
+              <w:right w:color="000000" w:space="0" w:sz="8" w:val="single"/>
+            </w:tcBorders>
+            <w:shd w:fill="ffffff" w:val="clear"/>
+            <w:tcMar>
+              <w:top w:w="80.0" w:type="dxa"/>
+              <w:left w:w="100.0" w:type="dxa"/>
+              <w:bottom w:w="80.0" w:type="dxa"/>
+              <w:right w:w="100.0" w:type="dxa"/>
+            </w:tcMar>
+            <w:vAlign w:val="top"/>
+          </w:tcPr>
+          <w:p>
+            <w:pPr>
+              <w:spacing w:after="200" w:before="220" w:lineRule="auto"/>
+              <w:rPr>
+                <w:color w:val="434343"/>
+                <w:sz w:val="24"/>
+                <w:szCs w:val="24"/>
+              </w:rPr>
+            </w:pPr>
+            <w:r>
+              <w:rPr>
+                <w:color w:val="434343"/>
+                <w:sz w:val="24"/>
+                <w:szCs w:val="24"/>
                 <w:rtl w:val="0"/>
               </w:rPr>
               <w:t xml:space="preserve">Separación estricta entre Frontend Flutter, API Node.js y Base MySQL.</w:t>
@@ -2216,30 +2457,34 @@
         <w:tc>
           <w:tcPr>
             <w:tcBorders>
-              <w:top w:color="000000" w:space="0" w:sz="0" w:val="nil"/>
-              <w:left w:color="000000" w:space="0" w:sz="0" w:val="nil"/>
-              <w:bottom w:color="000000" w:space="0" w:sz="0" w:val="nil"/>
-              <w:right w:color="000000" w:space="0" w:sz="0" w:val="nil"/>
-            </w:tcBorders>
-            <w:shd w:fill="f4f6f9" w:val="clear"/>
-            <w:tcMar>
-              <w:top w:w="80.0" w:type="dxa"/>
-              <w:left w:w="100.0" w:type="dxa"/>
-              <w:bottom w:w="80.0" w:type="dxa"/>
-              <w:right w:w="100.0" w:type="dxa"/>
-            </w:tcMar>
-            <w:vAlign w:val="top"/>
-          </w:tcPr>
-          <w:p>
-            <w:pPr>
-              <w:spacing w:after="200" w:before="220" w:lineRule="auto"/>
-              <w:rPr>
-                <w:color w:val="2d3748"/>
-              </w:rPr>
-            </w:pPr>
-            <w:r>
-              <w:rPr>
-                <w:color w:val="2d3748"/>
+              <w:top w:color="000000" w:space="0" w:sz="8" w:val="single"/>
+              <w:left w:color="000000" w:space="0" w:sz="8" w:val="single"/>
+              <w:bottom w:color="000000" w:space="0" w:sz="8" w:val="single"/>
+              <w:right w:color="000000" w:space="0" w:sz="8" w:val="single"/>
+            </w:tcBorders>
+            <w:shd w:fill="ffffff" w:val="clear"/>
+            <w:tcMar>
+              <w:top w:w="80.0" w:type="dxa"/>
+              <w:left w:w="100.0" w:type="dxa"/>
+              <w:bottom w:w="80.0" w:type="dxa"/>
+              <w:right w:w="100.0" w:type="dxa"/>
+            </w:tcMar>
+            <w:vAlign w:val="top"/>
+          </w:tcPr>
+          <w:p>
+            <w:pPr>
+              <w:spacing w:after="200" w:before="220" w:lineRule="auto"/>
+              <w:rPr>
+                <w:color w:val="434343"/>
+                <w:sz w:val="24"/>
+                <w:szCs w:val="24"/>
+              </w:rPr>
+            </w:pPr>
+            <w:r>
+              <w:rPr>
+                <w:color w:val="434343"/>
+                <w:sz w:val="24"/>
+                <w:szCs w:val="24"/>
                 <w:rtl w:val="0"/>
               </w:rPr>
               <w:t xml:space="preserve">JSON HTTP REST</w:t>
@@ -2254,18 +2499,18 @@
         <w:rPr>
           <w:b w:val="1"/>
           <w:bCs w:val="1"/>
-          <w:color w:val="1b365d"/>
-          <w:sz w:val="36"/>
-          <w:szCs w:val="36"/>
+          <w:color w:val="434343"/>
+          <w:sz w:val="24"/>
+          <w:szCs w:val="24"/>
         </w:rPr>
       </w:pPr>
       <w:r>
         <w:rPr>
           <w:b w:val="1"/>
           <w:bCs w:val="1"/>
-          <w:color w:val="1b365d"/>
-          <w:sz w:val="36"/>
-          <w:szCs w:val="36"/>
+          <w:color w:val="434343"/>
+          <w:sz w:val="24"/>
+          <w:szCs w:val="24"/>
           <w:rtl w:val="0"/>
         </w:rPr>
         <w:t xml:space="preserve">3. Diseño y Script de Base de Datos (MySQL)</w:t>
@@ -2277,14 +2522,16 @@
         <w:rPr>
           <w:b w:val="1"/>
           <w:bCs w:val="1"/>
-          <w:color w:val="1b365d"/>
-          <w:sz w:val="36"/>
-          <w:szCs w:val="36"/>
+          <w:color w:val="434343"/>
+          <w:sz w:val="24"/>
+          <w:szCs w:val="24"/>
         </w:rPr>
       </w:pPr>
       <w:r>
         <w:rPr>
-          <w:color w:val="2d3748"/>
+          <w:color w:val="434343"/>
+          <w:sz w:val="24"/>
+          <w:szCs w:val="24"/>
           <w:rtl w:val="0"/>
         </w:rPr>
         <w:t xml:space="preserve">La base de datos relacional </w:t>
@@ -2293,14 +2540,18 @@
         <w:rPr>
           <w:b w:val="1"/>
           <w:bCs w:val="1"/>
-          <w:color w:val="2d3748"/>
+          <w:color w:val="434343"/>
+          <w:sz w:val="24"/>
+          <w:szCs w:val="24"/>
           <w:rtl w:val="0"/>
         </w:rPr>
         <w:t xml:space="preserve">universidad_db</w:t>
       </w:r>
       <w:r>
         <w:rPr>
-          <w:color w:val="2d3748"/>
+          <w:color w:val="434343"/>
+          <w:sz w:val="24"/>
+          <w:szCs w:val="24"/>
           <w:rtl w:val="0"/>
         </w:rPr>
         <w:t xml:space="preserve"> almacena la información requerida en la tabla </w:t>
@@ -2309,21 +2560,27 @@
         <w:rPr>
           <w:b w:val="1"/>
           <w:bCs w:val="1"/>
-          <w:color w:val="2d3748"/>
+          <w:color w:val="434343"/>
+          <w:sz w:val="24"/>
+          <w:szCs w:val="24"/>
           <w:rtl w:val="0"/>
         </w:rPr>
         <w:t xml:space="preserve">materias</w:t>
       </w:r>
       <w:r>
         <w:rPr>
-          <w:color w:val="2d3748"/>
+          <w:color w:val="434343"/>
+          <w:sz w:val="24"/>
+          <w:szCs w:val="24"/>
           <w:rtl w:val="0"/>
         </w:rPr>
         <w:t xml:space="preserve">. A continuación se adjunta el script DDL y DML ejecutado:</w:t>
       </w:r>
       <w:r>
         <w:rPr>
-          <w:color w:val="2d3748"/>
+          <w:color w:val="434343"/>
+          <w:sz w:val="24"/>
+          <w:szCs w:val="24"/>
         </w:rPr>
         <w:drawing>
           <wp:inline distB="114300" distT="114300" distL="114300" distR="114300">
@@ -2362,9 +2619,9 @@
         <w:rPr>
           <w:b w:val="1"/>
           <w:bCs w:val="1"/>
-          <w:color w:val="1b365d"/>
-          <w:sz w:val="36"/>
-          <w:szCs w:val="36"/>
+          <w:color w:val="434343"/>
+          <w:sz w:val="24"/>
+          <w:szCs w:val="24"/>
           <w:rtl w:val="0"/>
         </w:rPr>
         <w:t xml:space="preserve">4. Arquitectura del Backend API (Node.js + Express)</w:t>
@@ -2374,12 +2631,16 @@
       <w:pPr>
         <w:spacing w:after="200" w:before="220" w:lineRule="auto"/>
         <w:rPr>
-          <w:color w:val="2d3748"/>
+          <w:color w:val="434343"/>
+          <w:sz w:val="24"/>
+          <w:szCs w:val="24"/>
         </w:rPr>
       </w:pPr>
       <w:r>
         <w:rPr>
-          <w:color w:val="2d3748"/>
+          <w:color w:val="434343"/>
+          <w:sz w:val="24"/>
+          <w:szCs w:val="24"/>
           <w:rtl w:val="0"/>
         </w:rPr>
         <w:t xml:space="preserve">El backend expone un endpoint REST bajo la ruta </w:t>
@@ -2388,14 +2649,18 @@
         <w:rPr>
           <w:b w:val="1"/>
           <w:bCs w:val="1"/>
-          <w:color w:val="2d3748"/>
+          <w:color w:val="434343"/>
+          <w:sz w:val="24"/>
+          <w:szCs w:val="24"/>
           <w:rtl w:val="0"/>
         </w:rPr>
         <w:t xml:space="preserve">GET /api/materias</w:t>
       </w:r>
       <w:r>
         <w:rPr>
-          <w:color w:val="2d3748"/>
+          <w:color w:val="434343"/>
+          <w:sz w:val="24"/>
+          <w:szCs w:val="24"/>
           <w:rtl w:val="0"/>
         </w:rPr>
         <w:t xml:space="preserve">. Se utiliza el paquete </w:t>
@@ -2404,14 +2669,18 @@
         <w:rPr>
           <w:b w:val="1"/>
           <w:bCs w:val="1"/>
-          <w:color w:val="2d3748"/>
+          <w:color w:val="434343"/>
+          <w:sz w:val="24"/>
+          <w:szCs w:val="24"/>
           <w:rtl w:val="0"/>
         </w:rPr>
         <w:t xml:space="preserve">mysql2</w:t>
       </w:r>
       <w:r>
         <w:rPr>
-          <w:color w:val="2d3748"/>
+          <w:color w:val="434343"/>
+          <w:sz w:val="24"/>
+          <w:szCs w:val="24"/>
           <w:rtl w:val="0"/>
         </w:rPr>
         <w:t xml:space="preserve"> para la conexión a la base de datos y </w:t>
@@ -2420,14 +2689,18 @@
         <w:rPr>
           <w:b w:val="1"/>
           <w:bCs w:val="1"/>
-          <w:color w:val="2d3748"/>
+          <w:color w:val="434343"/>
+          <w:sz w:val="24"/>
+          <w:szCs w:val="24"/>
           <w:rtl w:val="0"/>
         </w:rPr>
         <w:t xml:space="preserve">cors</w:t>
       </w:r>
       <w:r>
         <w:rPr>
-          <w:color w:val="2d3748"/>
+          <w:color w:val="434343"/>
+          <w:sz w:val="24"/>
+          <w:szCs w:val="24"/>
           <w:rtl w:val="0"/>
         </w:rPr>
         <w:t xml:space="preserve"> para permitir la comunicación entre dominios de forma segura.</w:t>
@@ -2439,18 +2712,18 @@
         <w:rPr>
           <w:b w:val="1"/>
           <w:bCs w:val="1"/>
-          <w:color w:val="1b365d"/>
-          <w:sz w:val="36"/>
-          <w:szCs w:val="36"/>
+          <w:color w:val="434343"/>
+          <w:sz w:val="24"/>
+          <w:szCs w:val="24"/>
         </w:rPr>
       </w:pPr>
       <w:r>
         <w:rPr>
           <w:b w:val="1"/>
           <w:bCs w:val="1"/>
-          <w:color w:val="2b6cb0"/>
-          <w:sz w:val="28"/>
-          <w:szCs w:val="28"/>
+          <w:color w:val="434343"/>
+          <w:sz w:val="24"/>
+          <w:szCs w:val="24"/>
           <w:rtl w:val="0"/>
         </w:rPr>
         <w:t xml:space="preserve">4.1 Código Fuente del Servidor (server.js)</w:t>
@@ -2459,9 +2732,9 @@
         <w:rPr>
           <w:b w:val="1"/>
           <w:bCs w:val="1"/>
-          <w:color w:val="2b6cb0"/>
-          <w:sz w:val="28"/>
-          <w:szCs w:val="28"/>
+          <w:color w:val="434343"/>
+          <w:sz w:val="24"/>
+          <w:szCs w:val="24"/>
         </w:rPr>
         <w:drawing>
           <wp:inline distB="114300" distT="114300" distL="114300" distR="114300">
@@ -2500,9 +2773,9 @@
         <w:rPr>
           <w:b w:val="1"/>
           <w:bCs w:val="1"/>
-          <w:color w:val="1b365d"/>
-          <w:sz w:val="36"/>
-          <w:szCs w:val="36"/>
+          <w:color w:val="434343"/>
+          <w:sz w:val="24"/>
+          <w:szCs w:val="24"/>
           <w:rtl w:val="0"/>
         </w:rPr>
         <w:t xml:space="preserve">5. Aplicación Frontend Sencilla en Flutter</w:t>
@@ -2512,12 +2785,16 @@
       <w:pPr>
         <w:spacing w:after="200" w:before="220" w:lineRule="auto"/>
         <w:rPr>
-          <w:color w:val="2d3748"/>
+          <w:color w:val="434343"/>
+          <w:sz w:val="24"/>
+          <w:szCs w:val="24"/>
         </w:rPr>
       </w:pPr>
       <w:r>
         <w:rPr>
-          <w:color w:val="2d3748"/>
+          <w:color w:val="434343"/>
+          <w:sz w:val="24"/>
+          <w:szCs w:val="24"/>
           <w:rtl w:val="0"/>
         </w:rPr>
         <w:t xml:space="preserve">La interfaz gráfica de usuario está construida en Flutter. Consume la API REST mediante la librería </w:t>
@@ -2526,14 +2803,18 @@
         <w:rPr>
           <w:b w:val="1"/>
           <w:bCs w:val="1"/>
-          <w:color w:val="2d3748"/>
+          <w:color w:val="434343"/>
+          <w:sz w:val="24"/>
+          <w:szCs w:val="24"/>
           <w:rtl w:val="0"/>
         </w:rPr>
         <w:t xml:space="preserve">http</w:t>
       </w:r>
       <w:r>
         <w:rPr>
-          <w:color w:val="2d3748"/>
+          <w:color w:val="434343"/>
+          <w:sz w:val="24"/>
+          <w:szCs w:val="24"/>
           <w:rtl w:val="0"/>
         </w:rPr>
         <w:t xml:space="preserve"> y renderiza las asignaturas de manera dinámica con el widget </w:t>
@@ -2542,14 +2823,18 @@
         <w:rPr>
           <w:b w:val="1"/>
           <w:bCs w:val="1"/>
-          <w:color w:val="2d3748"/>
+          <w:color w:val="434343"/>
+          <w:sz w:val="24"/>
+          <w:szCs w:val="24"/>
           <w:rtl w:val="0"/>
         </w:rPr>
         <w:t xml:space="preserve">ListView.builder</w:t>
       </w:r>
       <w:r>
         <w:rPr>
-          <w:color w:val="2d3748"/>
+          <w:color w:val="434343"/>
+          <w:sz w:val="24"/>
+          <w:szCs w:val="24"/>
           <w:rtl w:val="0"/>
         </w:rPr>
         <w:t xml:space="preserve">.</w:t>
@@ -2561,18 +2846,18 @@
         <w:rPr>
           <w:b w:val="1"/>
           <w:bCs w:val="1"/>
-          <w:color w:val="2b6cb0"/>
-          <w:sz w:val="28"/>
-          <w:szCs w:val="28"/>
+          <w:color w:val="434343"/>
+          <w:sz w:val="24"/>
+          <w:szCs w:val="24"/>
         </w:rPr>
       </w:pPr>
       <w:r>
         <w:rPr>
           <w:b w:val="1"/>
           <w:bCs w:val="1"/>
-          <w:color w:val="2b6cb0"/>
-          <w:sz w:val="28"/>
-          <w:szCs w:val="28"/>
+          <w:color w:val="434343"/>
+          <w:sz w:val="24"/>
+          <w:szCs w:val="24"/>
           <w:rtl w:val="0"/>
         </w:rPr>
         <w:t xml:space="preserve">5.1 Código Principal (main.dart)</w:t>
@@ -2584,18 +2869,18 @@
         <w:rPr>
           <w:b w:val="1"/>
           <w:bCs w:val="1"/>
-          <w:color w:val="2b6cb0"/>
-          <w:sz w:val="28"/>
-          <w:szCs w:val="28"/>
+          <w:color w:val="434343"/>
+          <w:sz w:val="24"/>
+          <w:szCs w:val="24"/>
         </w:rPr>
       </w:pPr>
       <w:r>
         <w:rPr>
           <w:b w:val="1"/>
           <w:bCs w:val="1"/>
-          <w:color w:val="2b6cb0"/>
-          <w:sz w:val="28"/>
-          <w:szCs w:val="28"/>
+          <w:color w:val="434343"/>
+          <w:sz w:val="24"/>
+          <w:szCs w:val="24"/>
         </w:rPr>
         <w:drawing>
           <wp:inline distB="114300" distT="114300" distL="114300" distR="114300">
@@ -2642,18 +2927,18 @@
         <w:rPr>
           <w:b w:val="1"/>
           <w:bCs w:val="1"/>
-          <w:color w:val="1b365d"/>
-          <w:sz w:val="36"/>
-          <w:szCs w:val="36"/>
+          <w:color w:val="434343"/>
+          <w:sz w:val="24"/>
+          <w:szCs w:val="24"/>
         </w:rPr>
       </w:pPr>
       <w:r>
         <w:rPr>
           <w:b w:val="1"/>
           <w:bCs w:val="1"/>
-          <w:color w:val="1b365d"/>
-          <w:sz w:val="36"/>
-          <w:szCs w:val="36"/>
+          <w:color w:val="434343"/>
+          <w:sz w:val="24"/>
+          <w:szCs w:val="24"/>
           <w:rtl w:val="0"/>
         </w:rPr>
         <w:t xml:space="preserve">6. Guía de Ejecución y Pruebas del Taller</w:t>
@@ -2663,12 +2948,16 @@
       <w:pPr>
         <w:spacing w:after="200" w:before="220" w:lineRule="auto"/>
         <w:rPr>
-          <w:color w:val="2d3748"/>
+          <w:color w:val="434343"/>
+          <w:sz w:val="24"/>
+          <w:szCs w:val="24"/>
         </w:rPr>
       </w:pPr>
       <w:r>
         <w:rPr>
-          <w:color w:val="2d3748"/>
+          <w:color w:val="434343"/>
+          <w:sz w:val="24"/>
+          <w:szCs w:val="24"/>
           <w:rtl w:val="0"/>
         </w:rPr>
         <w:t xml:space="preserve">Para verificar el funcionamiento integral del sistema, siga la siguiente secuencia de pasos:</w:t>
@@ -2679,21 +2968,27 @@
         <w:spacing w:after="80" w:before="220" w:lineRule="auto"/>
         <w:ind w:left="280" w:firstLine="0"/>
         <w:rPr>
-          <w:color w:val="2d3748"/>
+          <w:color w:val="434343"/>
+          <w:sz w:val="24"/>
+          <w:szCs w:val="24"/>
         </w:rPr>
       </w:pPr>
       <w:r>
         <w:rPr>
           <w:b w:val="1"/>
           <w:bCs w:val="1"/>
-          <w:color w:val="1b365d"/>
+          <w:color w:val="434343"/>
+          <w:sz w:val="24"/>
+          <w:szCs w:val="24"/>
           <w:rtl w:val="0"/>
         </w:rPr>
         <w:t xml:space="preserve">1. Base de Datos: </w:t>
       </w:r>
       <w:r>
         <w:rPr>
-          <w:color w:val="2d3748"/>
+          <w:color w:val="434343"/>
+          <w:sz w:val="24"/>
+          <w:szCs w:val="24"/>
           <w:rtl w:val="0"/>
         </w:rPr>
         <w:t xml:space="preserve">Iniciar el servicio de MySQL (XAMPP/WAMP o MySQL Server) e importar el script SQL en phpMyAdmin o MySQL Workbench.</w:t>
@@ -2704,21 +2999,27 @@
         <w:spacing w:after="80" w:before="220" w:lineRule="auto"/>
         <w:ind w:left="280" w:firstLine="0"/>
         <w:rPr>
-          <w:color w:val="2d3748"/>
+          <w:color w:val="434343"/>
+          <w:sz w:val="24"/>
+          <w:szCs w:val="24"/>
         </w:rPr>
       </w:pPr>
       <w:r>
         <w:rPr>
           <w:b w:val="1"/>
           <w:bCs w:val="1"/>
-          <w:color w:val="1b365d"/>
+          <w:color w:val="434343"/>
+          <w:sz w:val="24"/>
+          <w:szCs w:val="24"/>
           <w:rtl w:val="0"/>
         </w:rPr>
         <w:t xml:space="preserve">2. Backend Node.js: </w:t>
       </w:r>
       <w:r>
         <w:rPr>
-          <w:color w:val="2d3748"/>
+          <w:color w:val="434343"/>
+          <w:sz w:val="24"/>
+          <w:szCs w:val="24"/>
           <w:rtl w:val="0"/>
         </w:rPr>
         <w:t xml:space="preserve">Ejecutar `npm init -y`, instalar dependencias (`npm i express mysql2 cors`) y levantar el servidor con `node server.js`.</w:t>
@@ -2729,21 +3030,27 @@
         <w:spacing w:after="80" w:before="220" w:lineRule="auto"/>
         <w:ind w:left="280" w:firstLine="0"/>
         <w:rPr>
-          <w:color w:val="2d3748"/>
+          <w:color w:val="434343"/>
+          <w:sz w:val="24"/>
+          <w:szCs w:val="24"/>
         </w:rPr>
       </w:pPr>
       <w:r>
         <w:rPr>
           <w:b w:val="1"/>
           <w:bCs w:val="1"/>
-          <w:color w:val="1b365d"/>
+          <w:color w:val="434343"/>
+          <w:sz w:val="24"/>
+          <w:szCs w:val="24"/>
           <w:rtl w:val="0"/>
         </w:rPr>
         <w:t xml:space="preserve">3. Verificación API: </w:t>
       </w:r>
       <w:r>
         <w:rPr>
-          <w:color w:val="2d3748"/>
+          <w:color w:val="434343"/>
+          <w:sz w:val="24"/>
+          <w:szCs w:val="24"/>
           <w:rtl w:val="0"/>
         </w:rPr>
         <w:t xml:space="preserve">Abrir en el navegador `http://localhost:3000/api/materias` para comprobar el retorno del JSON con las 3 materias de prueba.</w:t>
@@ -2754,21 +3061,27 @@
         <w:spacing w:after="80" w:before="220" w:lineRule="auto"/>
         <w:ind w:left="280" w:firstLine="0"/>
         <w:rPr>
-          <w:color w:val="2d3748"/>
+          <w:color w:val="434343"/>
+          <w:sz w:val="24"/>
+          <w:szCs w:val="24"/>
         </w:rPr>
       </w:pPr>
       <w:r>
         <w:rPr>
           <w:b w:val="1"/>
           <w:bCs w:val="1"/>
-          <w:color w:val="1b365d"/>
+          <w:color w:val="434343"/>
+          <w:sz w:val="24"/>
+          <w:szCs w:val="24"/>
           <w:rtl w:val="0"/>
         </w:rPr>
         <w:t xml:space="preserve">4. Frontend Flutter: </w:t>
       </w:r>
       <w:r>
         <w:rPr>
-          <w:color w:val="2d3748"/>
+          <w:color w:val="434343"/>
+          <w:sz w:val="24"/>
+          <w:szCs w:val="24"/>
           <w:rtl w:val="0"/>
         </w:rPr>
         <w:t xml:space="preserve">Agregar `http: ^1.1.0` en `pubspec.yaml`, ejecutar `flutter run` y validar la visualización de la lista de clases en el emulador.</w:t>
@@ -2776,7 +3089,11 @@
     </w:p>
     <w:p>
       <w:pPr>
-        <w:rPr/>
+        <w:rPr>
+          <w:color w:val="434343"/>
+          <w:sz w:val="24"/>
+          <w:szCs w:val="24"/>
+        </w:rPr>
       </w:pPr>
       <w:r>
         <w:rPr>

</xml_diff>